<commit_message>
Incorporate all work log updates into interim report
Agent-Logs-Url: https://github.com/Jendope/ideal-octo-parakeet/sessions/161363ca-862f-49b9-b61c-b187da1cb79f

Co-authored-by: Jendope <158296725+Jendope@users.noreply.github.com>
</commit_message>
<xml_diff>
--- a/interim-report-revised.docx
+++ b/interim-report-revised.docx
@@ -11773,6 +11773,181 @@
           </w:p>
         </w:tc>
       </w:tr>
+      <w:tr>
+        <w:tc>
+          <w:tcPr>
+            <w:tcW w:w="0" w:type="auto"/>
+            <w:hideMark/>
+          </w:tcPr>
+          <w:p>
+            <w:r>
+              <w:t xml:space="preserve">Public Deployment</w:t>
+            </w:r>
+          </w:p>
+        </w:tc>
+        <w:tc>
+          <w:tcPr>
+            <w:tcW w:w="0" w:type="auto"/>
+            <w:hideMark/>
+          </w:tcPr>
+          <w:p>
+            <w:r>
+              <w:t xml:space="preserve">Hugging Face Spaces</w:t>
+            </w:r>
+          </w:p>
+        </w:tc>
+        <w:tc>
+          <w:tcPr>
+            <w:tcW w:w="0" w:type="auto"/>
+            <w:hideMark/>
+          </w:tcPr>
+          <w:p>
+            <w:r>
+              <w:t xml:space="preserve">Free cloud hosting platform enabling true public network access without VPN; used to deploy the RAG inference backend for external user access (Week 24, Mar 2026).</w:t>
+            </w:r>
+          </w:p>
+        </w:tc>
+      </w:tr>
+      <w:tr>
+        <w:tc>
+          <w:tcPr>
+            <w:tcW w:w="0" w:type="auto"/>
+            <w:hideMark/>
+          </w:tcPr>
+          <w:p>
+            <w:r>
+              <w:t xml:space="preserve">Supplementary Data Sources</w:t>
+            </w:r>
+          </w:p>
+        </w:tc>
+        <w:tc>
+          <w:tcPr>
+            <w:tcW w:w="0" w:type="auto"/>
+            <w:hideMark/>
+          </w:tcPr>
+          <w:p>
+            <w:r>
+              <w:t xml:space="preserve">ADCC (Anti-Deception Coordination Centre) + HKPF advisories</w:t>
+            </w:r>
+          </w:p>
+        </w:tc>
+        <w:tc>
+          <w:tcPr>
+            <w:tcW w:w="0" w:type="auto"/>
+            <w:hideMark/>
+          </w:tcPr>
+          <w:p>
+            <w:r>
+              <w:t xml:space="preserve">Additional authoritative Hong Kong anti-fraud sources integrated post-interim to broaden knowledge base coverage beyond HK01; addresses source homogeneity limitation.</w:t>
+            </w:r>
+          </w:p>
+        </w:tc>
+      </w:tr>
+      <w:tr>
+        <w:tc>
+          <w:tcPr>
+            <w:tcW w:w="0" w:type="auto"/>
+            <w:hideMark/>
+          </w:tcPr>
+          <w:p>
+            <w:r>
+              <w:t xml:space="preserve">Messaging Interface</w:t>
+            </w:r>
+          </w:p>
+        </w:tc>
+        <w:tc>
+          <w:tcPr>
+            <w:tcW w:w="0" w:type="auto"/>
+            <w:hideMark/>
+          </w:tcPr>
+          <w:p>
+            <w:r>
+              <w:t xml:space="preserve">WhatsApp Business API (robot proxy)</w:t>
+            </w:r>
+          </w:p>
+        </w:tc>
+        <w:tc>
+          <w:tcPr>
+            <w:tcW w:w="0" w:type="auto"/>
+            <w:hideMark/>
+          </w:tcPr>
+          <w:p>
+            <w:r>
+              <w:t xml:space="preserve">Conversational channel enabling public access via WhatsApp—widely used by Hong Kong residents including elderly users—eliminating the need to install a dedicated application (Week 26, Apr 2026).</w:t>
+            </w:r>
+          </w:p>
+        </w:tc>
+      </w:tr>
+      <w:tr>
+        <w:tc>
+          <w:tcPr>
+            <w:tcW w:w="0" w:type="auto"/>
+            <w:hideMark/>
+          </w:tcPr>
+          <w:p>
+            <w:r>
+              <w:t xml:space="preserve">Upgraded Embedding Model</w:t>
+            </w:r>
+          </w:p>
+        </w:tc>
+        <w:tc>
+          <w:tcPr>
+            <w:tcW w:w="0" w:type="auto"/>
+            <w:hideMark/>
+          </w:tcPr>
+          <w:p>
+            <w:r>
+              <w:t xml:space="preserve">Higher-dimensional Sentence-BERT variant</w:t>
+            </w:r>
+          </w:p>
+        </w:tc>
+        <w:tc>
+          <w:tcPr>
+            <w:tcW w:w="0" w:type="auto"/>
+            <w:hideMark/>
+          </w:tcPr>
+          <w:p>
+            <w:r>
+              <w:t xml:space="preserve">Replacement embedding model with higher vector dimensions, improving within-type cosine similarity and semantic recall accuracy compared to the original text2vec-base-chinese (Week 22, Mar 2026).</w:t>
+            </w:r>
+          </w:p>
+        </w:tc>
+      </w:tr>
+      <w:tr>
+        <w:tc>
+          <w:tcPr>
+            <w:tcW w:w="0" w:type="auto"/>
+            <w:hideMark/>
+          </w:tcPr>
+          <w:p>
+            <w:r>
+              <w:t xml:space="preserve">Network Tunnelling (Dev)</w:t>
+            </w:r>
+          </w:p>
+        </w:tc>
+        <w:tc>
+          <w:tcPr>
+            <w:tcW w:w="0" w:type="auto"/>
+            <w:hideMark/>
+          </w:tcPr>
+          <w:p>
+            <w:r>
+              <w:t xml:space="preserve">Ngrok</w:t>
+            </w:r>
+          </w:p>
+        </w:tc>
+        <w:tc>
+          <w:tcPr>
+            <w:tcW w:w="0" w:type="auto"/>
+            <w:hideMark/>
+          </w:tcPr>
+          <w:p>
+            <w:r>
+              <w:t xml:space="preserve">Temporary public network tunnelling used during development to test and debug the embedding model deployment on the public internet before migrating to Hugging Face (Week 23, Mar 2026).</w:t>
+            </w:r>
+          </w:p>
+        </w:tc>
+      </w:tr>
     </w:tbl>
     <w:p>
       <w:pPr>
@@ -12311,6 +12486,32 @@
     </w:p>
     <w:p>
       <w:pPr>
+        <w:pStyle w:val="Heading3"/>
+      </w:pPr>
+      <w:r>
+        <w:t xml:space="preserve">Conversational Access Layer (WhatsApp Integration)</w:t>
+      </w:r>
+    </w:p>
+    <w:p>
+      <w:r>
+        <w:t xml:space="preserve">Post-interim development introduced a WhatsApp-based conversational interface (Week 26, April 2026) as an alternative access channel to the RAG pipeline. A robot proxy receives user-submitted messages via WhatsApp, forwards them to the deployed backend on Hugging Face Spaces, and returns the fraud probability score and justification as a WhatsApp reply. This architecture eliminates the requirement for users—particularly elderly residents—to install a dedicated application, leveraging the near-universal adoption of WhatsApp in Hong Kong. A self-loop defect (the bot re-processing its own outgoing messages) was identified and resolved in Week 27 through sender-identity filtering and request deduplication logic.</w:t>
+      </w:r>
+    </w:p>
+    <w:p>
+      <w:pPr>
+        <w:pStyle w:val="Heading3"/>
+      </w:pPr>
+      <w:r>
+        <w:t xml:space="preserve">Public Deployment Layer (Hugging Face Spaces)</w:t>
+      </w:r>
+    </w:p>
+    <w:p>
+      <w:r>
+        <w:t xml:space="preserve">The RAG inference backend was migrated from a local Jupyter Notebook environment to Hugging Face Spaces in Week 24 (March 2026), achieving genuine public network accessibility for the first time. The deployment uses the upgraded higher-dimensional Sentence-BERT embedding model and a freshly rebuilt ChromaDB vector store incorporating data from HK01, ADCC, and HKPF. Ngrok public network tunnelling was used as an interim solution during Week 23 to validate deployment feasibility before committing to the Hugging Face platform.</w:t>
+      </w:r>
+    </w:p>
+    <w:p>
+      <w:pPr>
         <w:pStyle w:val="Heading2"/>
       </w:pPr>
       <w:bookmarkStart w:id="71" w:name="_Toc221570386"/>
@@ -12449,7 +12650,7 @@
               <w:rPr>
                 <w:lang w:val="en-HK"/>
               </w:rPr>
-              <w:t>No production access; system accessible only to development team via Jupyter Notebooks</w:t>
+              <w:t>Publicly accessible via Hugging Face deployment (Mar 2026); WhatsApp chatbot provides conversational interface without requiring app installation (Apr 2026).</w:t>
             </w:r>
           </w:p>
         </w:tc>
@@ -12508,7 +12709,7 @@
               <w:rPr>
                 <w:lang w:val="en-HK"/>
               </w:rPr>
-              <w:t>No accessibility features implemented; requires manual text transcription even in notebook environment</w:t>
+              <w:t>WhatsApp-based interface removes installation barrier for elderly users familiar with the platform; text-based input still required (voice input planned for future iteration).</w:t>
             </w:r>
           </w:p>
         </w:tc>
@@ -12527,7 +12728,7 @@
               <w:rPr>
                 <w:lang w:val="en-HK"/>
               </w:rPr>
-              <w:t>Inclusive design philosophy documented but not operationalized; screen reading remains aspirational</w:t>
+              <w:t>Screen reading not yet implemented; WhatsApp channel partially mitigates app-installation barrier but does not address manual transcription limitation for voice scams.</w:t>
             </w:r>
           </w:p>
         </w:tc>
@@ -13585,7 +13786,7 @@
               <w:rPr>
                 <w:lang w:val="en-HK"/>
               </w:rPr>
-              <w:t>N/A (development environment only)</w:t>
+              <w:t>Deployed on Hugging Face Spaces (Mar 2026); uptime subject to free-tier availability</w:t>
             </w:r>
           </w:p>
         </w:tc>
@@ -13604,7 +13805,7 @@
               <w:rPr>
                 <w:lang w:val="en-HK"/>
               </w:rPr>
-              <w:t>No production deployment</w:t>
+              <w:t>99.5% uptime not formally verified; free-tier hosting imposes resource limits</w:t>
             </w:r>
           </w:p>
         </w:tc>
@@ -13747,7 +13948,7 @@
               <w:rPr>
                 <w:lang w:val="en-HK"/>
               </w:rPr>
-              <w:t>No user interface exists</w:t>
+              <w:t>WhatsApp chatbot interface deployed (Apr 2026); WCAG compliance not yet assessed</w:t>
             </w:r>
             <w:r>
               <w:rPr>
@@ -13772,7 +13973,7 @@
               <w:rPr>
                 <w:lang w:val="en-HK"/>
               </w:rPr>
-              <w:t>Only notebook cell execution available</w:t>
+              <w:t>Conversational interface accessible via WhatsApp; full WCAG 2.1 audit pending</w:t>
             </w:r>
           </w:p>
         </w:tc>
@@ -17551,7 +17752,7 @@
               <w:rPr>
                 <w:lang w:val="en-HK"/>
               </w:rPr>
-              <w:t>Core pipeline validated in notebook environment</w:t>
+              <w:t>Completed: Core RAG pipeline validated in notebook environment with 86.4% alignment on 85 manually annotated cases; daily knowledge base updates operational via GitHub Actions.</w:t>
             </w:r>
           </w:p>
         </w:tc>
@@ -17676,7 +17877,7 @@
               <w:rPr>
                 <w:lang w:val="en-HK"/>
               </w:rPr>
-              <w:t>In progress (notebook MVP ready; frontend integration pending)</w:t>
+              <w:t>Substantially completed (Feb–Mar 2026): Notebook MVP delivered for interim demo. Post-interim: upgraded embedding model deployed, code modularised into three layers (acquisition/preprocessing, database creation, LLM configuration), and public network access achieved via Ngrok then migrated to Hugging Face Spaces.</w:t>
             </w:r>
           </w:p>
         </w:tc>
@@ -17773,7 +17974,7 @@
               <w:rPr>
                 <w:lang w:val="en-HK"/>
               </w:rPr>
-              <w:t>Planned</w:t>
+              <w:t>In progress (Apr 2026): WhatsApp chatbot deployed via robot proxy, providing public conversational access without app installation. Self-loop bug resolved; runtime efficiency optimised. MCP integration explored but deferred due to technical immaturity. ADCC and HKPF data sources integrated to broaden knowledge base.</w:t>
             </w:r>
           </w:p>
         </w:tc>
@@ -17938,6 +18139,19 @@
       <w:bookmarkEnd w:id="91"/>
       <w:bookmarkEnd w:id="92"/>
       <w:bookmarkEnd w:id="93"/>
+    </w:p>
+    <w:p>
+      <w:pPr>
+        <w:pStyle w:val="Heading2"/>
+      </w:pPr>
+      <w:r>
+        <w:t xml:space="preserve">Post-Interim Progress Summary (February – April 2026)</w:t>
+      </w:r>
+    </w:p>
+    <w:p>
+      <w:r>
+        <w:t xml:space="preserve">Following the interim presentation in February 2026, the team continued active development across four key areas. First, the embedding model was upgraded to a higher-dimensional Sentence-BERT variant (Week 22), resolving an initial finding that the RAG pipeline underperformed a standalone LLM on general data; the upgraded model and supplementary fraud data from ADCC and HKPF restored the RAG advantage on domain-specific queries. Second, the system was deployed to the public internet: Ngrok tunnelling was used for rapid debugging (Week 23), followed by a stable migration to Hugging Face Spaces (Week 24), achieving true public network access for the first time. Third, the codebase was modularised into three layers—data acquisition and preprocessing, database creation, and LLM configuration—improving maintainability and editability. Fourth, a WhatsApp chatbot was built using a robot proxy (Week 26), providing a conversational channel accessible to all Hong Kong residents without requiring a dedicated application install; a self-loop bug was identified and resolved in Week 27, and runtime efficiency was further optimised. Model Context Protocol (MCP) integration was explored as an accessibility channel for elderly users but deferred due to the technology's current immaturity and practical deployment challenges.</w:t>
+      </w:r>
     </w:p>
     <w:p>
       <w:pPr>
@@ -18688,6 +18902,306 @@
           </w:p>
         </w:tc>
       </w:tr>
+      <w:tr>
+        <w:tc>
+          <w:tcPr>
+            <w:tcW w:w="1305" w:type="dxa"/>
+            <w:hideMark/>
+          </w:tcPr>
+          <w:p>
+            <w:pPr>
+              <w:rPr>
+                <w:lang w:val="en-HK"/>
+              </w:rPr>
+            </w:pPr>
+            <w:r>
+              <w:rPr>
+                <w:lang w:val="en-HK"/>
+              </w:rPr>
+              <w:t xml:space="preserve">M6</w:t>
+            </w:r>
+          </w:p>
+        </w:tc>
+        <w:tc>
+          <w:tcPr>
+            <w:tcW w:w="1466" w:type="dxa"/>
+            <w:hideMark/>
+          </w:tcPr>
+          <w:p>
+            <w:pPr>
+              <w:rPr>
+                <w:lang w:val="en-HK"/>
+              </w:rPr>
+            </w:pPr>
+            <w:r>
+              <w:rPr>
+                <w:lang w:val="en-HK"/>
+              </w:rPr>
+              <w:t xml:space="preserve">Upgraded embedding model with improved recall accuracy</w:t>
+            </w:r>
+          </w:p>
+        </w:tc>
+        <w:tc>
+          <w:tcPr>
+            <w:tcW w:w="1045" w:type="dxa"/>
+            <w:hideMark/>
+          </w:tcPr>
+          <w:p>
+            <w:pPr>
+              <w:rPr>
+                <w:lang w:val="en-HK"/>
+              </w:rPr>
+            </w:pPr>
+            <w:r>
+              <w:rPr>
+                <w:lang w:val="en-HK"/>
+              </w:rPr>
+              <w:lastRenderedPageBreak/>
+              <w:t xml:space="preserve">Mar 2026</w:t>
+            </w:r>
+          </w:p>
+        </w:tc>
+        <w:tc>
+          <w:tcPr>
+            <w:tcW w:w="3204" w:type="dxa"/>
+            <w:hideMark/>
+          </w:tcPr>
+          <w:p>
+            <w:pPr>
+              <w:rPr>
+                <w:lang w:val="en-HK"/>
+              </w:rPr>
+            </w:pPr>
+            <w:r>
+              <w:rPr>
+                <w:lang w:val="en-HK"/>
+              </w:rPr>
+              <w:lastRenderedPageBreak/>
+              <w:t xml:space="preserve">Completed (Week 22): Replaced original text2vec-base-chinese with a higher-dimensional Sentence-BERT variant; new model demonstrates improved within-type cosine similarity and better discrimination of fraud sub-categories.</w:t>
+            </w:r>
+          </w:p>
+        </w:tc>
+        <w:tc>
+          <w:tcPr>
+            <w:tcW w:w="2931" w:type="dxa"/>
+            <w:hideMark/>
+          </w:tcPr>
+          <w:p>
+            <w:pPr>
+              <w:rPr>
+                <w:lang w:val="en-HK"/>
+              </w:rPr>
+            </w:pPr>
+            <w:r>
+              <w:rPr>
+                <w:lang w:val="en-HK"/>
+              </w:rPr>
+              <w:lastRenderedPageBreak/>
+              <w:t xml:space="preserve">main.ipynb re-executed with new vectorstore; improved cosine similarity scores observed on validation queries</w:t>
+            </w:r>
+          </w:p>
+        </w:tc>
+      </w:tr>
+      <w:tr>
+        <w:tc>
+          <w:tcPr>
+            <w:tcW w:w="1305" w:type="dxa"/>
+            <w:hideMark/>
+          </w:tcPr>
+          <w:p>
+            <w:pPr>
+              <w:rPr>
+                <w:lang w:val="en-HK"/>
+              </w:rPr>
+            </w:pPr>
+            <w:r>
+              <w:rPr>
+                <w:lang w:val="en-HK"/>
+              </w:rPr>
+              <w:t xml:space="preserve">M7</w:t>
+            </w:r>
+          </w:p>
+        </w:tc>
+        <w:tc>
+          <w:tcPr>
+            <w:tcW w:w="1466" w:type="dxa"/>
+            <w:hideMark/>
+          </w:tcPr>
+          <w:p>
+            <w:pPr>
+              <w:rPr>
+                <w:lang w:val="en-HK"/>
+              </w:rPr>
+            </w:pPr>
+            <w:r>
+              <w:rPr>
+                <w:lang w:val="en-HK"/>
+              </w:rPr>
+              <w:t xml:space="preserve">Public network deployment via Hugging Face Spaces</w:t>
+            </w:r>
+          </w:p>
+        </w:tc>
+        <w:tc>
+          <w:tcPr>
+            <w:tcW w:w="1045" w:type="dxa"/>
+            <w:hideMark/>
+          </w:tcPr>
+          <w:p>
+            <w:pPr>
+              <w:rPr>
+                <w:lang w:val="en-HK"/>
+              </w:rPr>
+            </w:pPr>
+            <w:r>
+              <w:rPr>
+                <w:lang w:val="en-HK"/>
+              </w:rPr>
+              <w:lastRenderedPageBreak/>
+              <w:t xml:space="preserve">Mar 2026</w:t>
+            </w:r>
+          </w:p>
+        </w:tc>
+        <w:tc>
+          <w:tcPr>
+            <w:tcW w:w="3204" w:type="dxa"/>
+            <w:hideMark/>
+          </w:tcPr>
+          <w:p>
+            <w:pPr>
+              <w:rPr>
+                <w:lang w:val="en-HK"/>
+              </w:rPr>
+            </w:pPr>
+            <w:r>
+              <w:rPr>
+                <w:lang w:val="en-HK"/>
+              </w:rPr>
+              <w:lastRenderedPageBreak/>
+              <w:t xml:space="preserve">Completed (Week 24): System deployed to Hugging Face Spaces, achieving genuine public network access. Preceded by Ngrok-based tunnelling (Week 23) for development debugging. Latest ChromaDB vector store configured with upgraded embedding model.</w:t>
+            </w:r>
+          </w:p>
+        </w:tc>
+        <w:tc>
+          <w:tcPr>
+            <w:tcW w:w="2931" w:type="dxa"/>
+            <w:hideMark/>
+          </w:tcPr>
+          <w:p>
+            <w:pPr>
+              <w:rPr>
+                <w:lang w:val="en-HK"/>
+              </w:rPr>
+            </w:pPr>
+            <w:r>
+              <w:rPr>
+                <w:lang w:val="en-HK"/>
+              </w:rPr>
+              <w:lastRenderedPageBreak/>
+              <w:t xml:space="preserve">Hugging Face deployment URL accessible externally; RAG pipeline responds to public queries</w:t>
+            </w:r>
+          </w:p>
+        </w:tc>
+      </w:tr>
+      <w:tr>
+        <w:tc>
+          <w:tcPr>
+            <w:tcW w:w="1305" w:type="dxa"/>
+            <w:hideMark/>
+          </w:tcPr>
+          <w:p>
+            <w:pPr>
+              <w:rPr>
+                <w:lang w:val="en-HK"/>
+              </w:rPr>
+            </w:pPr>
+            <w:r>
+              <w:rPr>
+                <w:lang w:val="en-HK"/>
+              </w:rPr>
+              <w:t xml:space="preserve">M8</w:t>
+            </w:r>
+          </w:p>
+        </w:tc>
+        <w:tc>
+          <w:tcPr>
+            <w:tcW w:w="1466" w:type="dxa"/>
+            <w:hideMark/>
+          </w:tcPr>
+          <w:p>
+            <w:pPr>
+              <w:rPr>
+                <w:lang w:val="en-HK"/>
+              </w:rPr>
+            </w:pPr>
+            <w:r>
+              <w:rPr>
+                <w:lang w:val="en-HK"/>
+              </w:rPr>
+              <w:t xml:space="preserve">WhatsApp conversational interface for public access</w:t>
+            </w:r>
+          </w:p>
+        </w:tc>
+        <w:tc>
+          <w:tcPr>
+            <w:tcW w:w="1045" w:type="dxa"/>
+            <w:hideMark/>
+          </w:tcPr>
+          <w:p>
+            <w:pPr>
+              <w:rPr>
+                <w:lang w:val="en-HK"/>
+              </w:rPr>
+            </w:pPr>
+            <w:r>
+              <w:rPr>
+                <w:lang w:val="en-HK"/>
+              </w:rPr>
+              <w:lastRenderedPageBreak/>
+              <w:t xml:space="preserve">Apr 2026</w:t>
+            </w:r>
+          </w:p>
+        </w:tc>
+        <w:tc>
+          <w:tcPr>
+            <w:tcW w:w="3204" w:type="dxa"/>
+            <w:hideMark/>
+          </w:tcPr>
+          <w:p>
+            <w:pPr>
+              <w:rPr>
+                <w:lang w:val="en-HK"/>
+              </w:rPr>
+            </w:pPr>
+            <w:r>
+              <w:rPr>
+                <w:lang w:val="en-HK"/>
+              </w:rPr>
+              <w:lastRenderedPageBreak/>
+              <w:t xml:space="preserve">Completed (Week 26–27): WhatsApp chatbot built using robot proxy, enabling Hong Kong residents (including elderly users) to submit suspicious messages via WhatsApp without installing a dedicated application. Self-loop bug (bot re-processing its own responses) resolved in Week 27; runtime efficiency optimised.</w:t>
+            </w:r>
+          </w:p>
+        </w:tc>
+        <w:tc>
+          <w:tcPr>
+            <w:tcW w:w="2931" w:type="dxa"/>
+            <w:hideMark/>
+          </w:tcPr>
+          <w:p>
+            <w:pPr>
+              <w:rPr>
+                <w:lang w:val="en-HK"/>
+              </w:rPr>
+            </w:pPr>
+            <w:r>
+              <w:rPr>
+                <w:lang w:val="en-HK"/>
+              </w:rPr>
+              <w:lastRenderedPageBreak/>
+              <w:t xml:space="preserve">WhatsApp bot responds correctly to test fraud queries forwarded via proxy; no self-loop recurrence observed after fix</w:t>
+            </w:r>
+          </w:p>
+        </w:tc>
+      </w:tr>
     </w:tbl>
     <w:p/>
     <w:p/>
@@ -19328,6 +19842,330 @@
           </w:p>
         </w:tc>
       </w:tr>
+      <w:tr>
+        <w:tc>
+          <w:tcPr>
+            <w:tcW w:w="0" w:type="auto"/>
+            <w:hideMark/>
+          </w:tcPr>
+          <w:p>
+            <w:pPr>
+              <w:rPr>
+                <w:lang w:val="en-HK"/>
+              </w:rPr>
+            </w:pPr>
+            <w:r>
+              <w:rPr>
+                <w:lang w:val="en-HK"/>
+              </w:rPr>
+              <w:t xml:space="preserve">RAG vs. Pure LLM Performance Gap</w:t>
+            </w:r>
+          </w:p>
+        </w:tc>
+        <w:tc>
+          <w:tcPr>
+            <w:tcW w:w="0" w:type="auto"/>
+            <w:hideMark/>
+          </w:tcPr>
+          <w:p>
+            <w:pPr>
+              <w:jc w:val="both"/>
+              <w:rPr>
+                <w:lang w:val="en-HK"/>
+              </w:rPr>
+            </w:pPr>
+            <w:r>
+              <w:rPr>
+                <w:lang w:val="en-HK"/>
+              </w:rPr>
+              <w:t xml:space="preserve">Initial post-interim testing (Week 22) revealed that with general data and an unoptimised model, the RAG pipeline did not outperform a standalone LLM, undermining the core value proposition.</w:t>
+            </w:r>
+          </w:p>
+        </w:tc>
+        <w:tc>
+          <w:tcPr>
+            <w:tcW w:w="0" w:type="auto"/>
+            <w:hideMark/>
+          </w:tcPr>
+          <w:p>
+            <w:pPr>
+              <w:jc w:val="both"/>
+              <w:rPr>
+                <w:lang w:val="en-HK"/>
+              </w:rPr>
+            </w:pPr>
+            <w:r>
+              <w:rPr>
+                <w:lang w:val="en-HK"/>
+              </w:rPr>
+              <w:t xml:space="preserve">Collected domain-specific, recent Hong Kong fraud data from ADCC and HKPF; replaced embedding model with a higher-dimensional variant for better semantic discrimination; rebuilt ChromaDB vector store with new embeddings.</w:t>
+            </w:r>
+          </w:p>
+        </w:tc>
+        <w:tc>
+          <w:tcPr>
+            <w:tcW w:w="0" w:type="auto"/>
+            <w:hideMark/>
+          </w:tcPr>
+          <w:p>
+            <w:pPr>
+              <w:jc w:val="both"/>
+              <w:rPr>
+                <w:lang w:val="en-HK"/>
+              </w:rPr>
+            </w:pPr>
+            <w:r>
+              <w:rPr>
+                <w:lang w:val="en-HK"/>
+              </w:rPr>
+              <w:t xml:space="preserve">Resolved: upgraded embedding model and enriched knowledge base restored RAG advantage over baseline LLM on fraud-specific queries (Week 23–24).</w:t>
+            </w:r>
+          </w:p>
+        </w:tc>
+      </w:tr>
+      <w:tr>
+        <w:tc>
+          <w:tcPr>
+            <w:tcW w:w="0" w:type="auto"/>
+            <w:hideMark/>
+          </w:tcPr>
+          <w:p>
+            <w:pPr>
+              <w:rPr>
+                <w:lang w:val="en-HK"/>
+              </w:rPr>
+            </w:pPr>
+            <w:r>
+              <w:rPr>
+                <w:lang w:val="en-HK"/>
+              </w:rPr>
+              <w:t xml:space="preserve">Public Network Deployment Complexity</w:t>
+            </w:r>
+          </w:p>
+        </w:tc>
+        <w:tc>
+          <w:tcPr>
+            <w:tcW w:w="0" w:type="auto"/>
+            <w:hideMark/>
+          </w:tcPr>
+          <w:p>
+            <w:pPr>
+              <w:jc w:val="both"/>
+              <w:rPr>
+                <w:lang w:val="en-HK"/>
+              </w:rPr>
+            </w:pPr>
+            <w:r>
+              <w:rPr>
+                <w:lang w:val="en-HK"/>
+              </w:rPr>
+              <w:t xml:space="preserve">Embedding model and RAG pipeline, functional in local Jupyter environments, encountered deployment errors when exposed to the public internet, blocking external user access.</w:t>
+            </w:r>
+          </w:p>
+        </w:tc>
+        <w:tc>
+          <w:tcPr>
+            <w:tcW w:w="0" w:type="auto"/>
+            <w:hideMark/>
+          </w:tcPr>
+          <w:p>
+            <w:pPr>
+              <w:jc w:val="both"/>
+              <w:rPr>
+                <w:lang w:val="en-HK"/>
+              </w:rPr>
+            </w:pPr>
+            <w:r>
+              <w:rPr>
+                <w:lang w:val="en-HK"/>
+              </w:rPr>
+              <w:t xml:space="preserve">Adopted a two-stage approach: Ngrok tunnelling for rapid iteration and debugging (Week 23), followed by migration to Hugging Face Spaces for stable, free-tier public hosting (Week 24).</w:t>
+            </w:r>
+          </w:p>
+        </w:tc>
+        <w:tc>
+          <w:tcPr>
+            <w:tcW w:w="0" w:type="auto"/>
+            <w:hideMark/>
+          </w:tcPr>
+          <w:p>
+            <w:pPr>
+              <w:jc w:val="both"/>
+              <w:rPr>
+                <w:lang w:val="en-HK"/>
+              </w:rPr>
+            </w:pPr>
+            <w:r>
+              <w:rPr>
+                <w:lang w:val="en-HK"/>
+              </w:rPr>
+              <w:t xml:space="preserve">Resolved: Hugging Face deployment operational; public queries handled without anomalies.</w:t>
+            </w:r>
+          </w:p>
+        </w:tc>
+      </w:tr>
+      <w:tr>
+        <w:tc>
+          <w:tcPr>
+            <w:tcW w:w="0" w:type="auto"/>
+            <w:hideMark/>
+          </w:tcPr>
+          <w:p>
+            <w:pPr>
+              <w:rPr>
+                <w:lang w:val="en-HK"/>
+              </w:rPr>
+            </w:pPr>
+            <w:r>
+              <w:rPr>
+                <w:lang w:val="en-HK"/>
+              </w:rPr>
+              <w:t xml:space="preserve">MCP Integration Infeasibility</w:t>
+            </w:r>
+          </w:p>
+        </w:tc>
+        <w:tc>
+          <w:tcPr>
+            <w:tcW w:w="0" w:type="auto"/>
+            <w:hideMark/>
+          </w:tcPr>
+          <w:p>
+            <w:pPr>
+              <w:jc w:val="both"/>
+              <w:rPr>
+                <w:lang w:val="en-HK"/>
+              </w:rPr>
+            </w:pPr>
+            <w:r>
+              <w:rPr>
+                <w:lang w:val="en-HK"/>
+              </w:rPr>
+              <w:t xml:space="preserve">Model Context Protocol (MCP) was explored as a mechanism to enable voice-controlled phone-agent access for elderly users, but the technology proved too immature for reliable production use within the project timeline.</w:t>
+            </w:r>
+          </w:p>
+        </w:tc>
+        <w:tc>
+          <w:tcPr>
+            <w:tcW w:w="0" w:type="auto"/>
+            <w:hideMark/>
+          </w:tcPr>
+          <w:p>
+            <w:pPr>
+              <w:jc w:val="both"/>
+              <w:rPr>
+                <w:lang w:val="en-HK"/>
+              </w:rPr>
+            </w:pPr>
+            <w:r>
+              <w:rPr>
+                <w:lang w:val="en-HK"/>
+              </w:rPr>
+              <w:t xml:space="preserve">Pivoted to WhatsApp proxy as a more practical accessibility channel—widely adopted by Hong Kong residents including elderly users—requiring no app installation and no familiarity with AI tools such as AutoGLM or Cursor.</w:t>
+            </w:r>
+          </w:p>
+        </w:tc>
+        <w:tc>
+          <w:tcPr>
+            <w:tcW w:w="0" w:type="auto"/>
+            <w:hideMark/>
+          </w:tcPr>
+          <w:p>
+            <w:pPr>
+              <w:jc w:val="both"/>
+              <w:rPr>
+                <w:lang w:val="en-HK"/>
+              </w:rPr>
+            </w:pPr>
+            <w:r>
+              <w:rPr>
+                <w:lang w:val="en-HK"/>
+              </w:rPr>
+              <w:t xml:space="preserve">Resolved by design change: WhatsApp chatbot deployed successfully (Week 26).</w:t>
+            </w:r>
+          </w:p>
+        </w:tc>
+      </w:tr>
+      <w:tr>
+        <w:tc>
+          <w:tcPr>
+            <w:tcW w:w="0" w:type="auto"/>
+            <w:hideMark/>
+          </w:tcPr>
+          <w:p>
+            <w:pPr>
+              <w:rPr>
+                <w:lang w:val="en-HK"/>
+              </w:rPr>
+            </w:pPr>
+            <w:r>
+              <w:rPr>
+                <w:lang w:val="en-HK"/>
+              </w:rPr>
+              <w:t xml:space="preserve">WhatsApp Bot Self-Loop</w:t>
+            </w:r>
+          </w:p>
+        </w:tc>
+        <w:tc>
+          <w:tcPr>
+            <w:tcW w:w="0" w:type="auto"/>
+            <w:hideMark/>
+          </w:tcPr>
+          <w:p>
+            <w:pPr>
+              <w:jc w:val="both"/>
+              <w:rPr>
+                <w:lang w:val="en-HK"/>
+              </w:rPr>
+            </w:pPr>
+            <w:r>
+              <w:rPr>
+                <w:lang w:val="en-HK"/>
+              </w:rPr>
+              <w:t xml:space="preserve">The WhatsApp robot proxy re-submitted its own generated responses as new user queries, creating an infinite API request loop and degrading system reliability.</w:t>
+            </w:r>
+          </w:p>
+        </w:tc>
+        <w:tc>
+          <w:tcPr>
+            <w:tcW w:w="0" w:type="auto"/>
+            <w:hideMark/>
+          </w:tcPr>
+          <w:p>
+            <w:pPr>
+              <w:jc w:val="both"/>
+              <w:rPr>
+                <w:lang w:val="en-HK"/>
+              </w:rPr>
+            </w:pPr>
+            <w:r>
+              <w:rPr>
+                <w:lang w:val="en-HK"/>
+              </w:rPr>
+              <w:t xml:space="preserve">Implemented sender-identity filtering to distinguish user-originated messages from bot-generated responses; added request deduplication logic.</w:t>
+            </w:r>
+          </w:p>
+        </w:tc>
+        <w:tc>
+          <w:tcPr>
+            <w:tcW w:w="0" w:type="auto"/>
+            <w:hideMark/>
+          </w:tcPr>
+          <w:p>
+            <w:pPr>
+              <w:jc w:val="both"/>
+              <w:rPr>
+                <w:lang w:val="en-HK"/>
+              </w:rPr>
+            </w:pPr>
+            <w:r>
+              <w:rPr>
+                <w:lang w:val="en-HK"/>
+              </w:rPr>
+              <w:t xml:space="preserve">Resolved (Week 27): No self-loop recurrence observed in subsequent testing.</w:t>
+            </w:r>
+          </w:p>
+        </w:tc>
+      </w:tr>
     </w:tbl>
     <w:p/>
     <w:p>
@@ -19591,6 +20429,8 @@
                 <w:lang w:val="en-HK" w:eastAsia="zh-CN"/>
               </w:rPr>
               <w:t>606-article knowledge base harvested via HK01 API pagination (101 requests)</w:t>
+              <w:br/>
+              <w:t>Assisted with ADCC/HK01 web scraping post-interim; reinforced HTML parsing and privacy compliance documentation; evaluated MCP and WhatsApp integration options; coordinated post-interim technical direction.</w:t>
             </w:r>
           </w:p>
           <w:p>
@@ -19793,6 +20633,8 @@
                 <w:lang w:val="en-HK" w:eastAsia="zh-CN"/>
               </w:rPr>
               <w:t>Functional RAG inference engine (86.4% alignment with HKMA cases)</w:t>
+              <w:br/>
+              <w:t>Upgraded embedding model with higher-dimensional variant and rebuilt ChromaDB store; collected ADCC/HKPF data; deployed system publicly via Ngrok then Hugging Face Spaces; built and debugged WhatsApp chatbot (robot proxy); optimised runtime efficiency.</w:t>
             </w:r>
           </w:p>
           <w:p>

</xml_diff>

<commit_message>
Add AI member, reranking section, no-app and dataset justifications to report
Agent-Logs-Url: https://github.com/Jendope/ideal-octo-parakeet/sessions/2d4f82ce-34c1-4ea6-a958-39c60acddcd8

Co-authored-by: Jendope <158296725+Jendope@users.noreply.github.com>
</commit_message>
<xml_diff>
--- a/interim-report-revised.docx
+++ b/interim-report-revised.docx
@@ -10367,6 +10367,1502 @@
     </w:p>
     <w:p>
       <w:pPr>
+        <w:pStyle w:val="Heading3"/>
+      </w:pPr>
+      <w:r>
+        <w:t xml:space="preserve">Reranking Technology: Considered but Not Implemented</w:t>
+      </w:r>
+    </w:p>
+    <w:p>
+      <w:r>
+        <w:t xml:space="preserve">During the post-interim literature review phase, the team investigated reranking as a potential enhancement to the RAG retrieval pipeline. Reranking is a two-stage retrieval strategy in which an initial pool of candidate documents retrieved by cosine similarity search is re-scored and re-ordered by a dedicated cross-encoder neural network model (such as bge-reranker or Cohere Rerank) before being passed to the LLM. Unlike the cosine similarity metric—which measures "how similar the vectors look"—a reranker reads the query and each candidate document together and produces a relevance score reflecting "how relevant the neural network finds them after careful reading." The reranker score is not a mathematical formula but a neural network inference output; its primary function is ranking candidate documents by query relevance, not semantic vector proximity (MongoDB, 2025; NVIDIA, 2025).</w:t>
+      </w:r>
+    </w:p>
+    <w:p>
+      <w:r>
+        <w:t xml:space="preserve">Research from LlamaIndex (2023) demonstrates that reranking consistently improves both Hit Rate and Mean Reciprocal Rank (MRR) across all tested embedding models. The benchmark results below compare retrieval performance with and without reranking across three reranker variants (bge-reranker-base, bge-reranker-large, and Cohere-Reranker):</w:t>
+      </w:r>
+    </w:p>
+    <w:tbl>
+      <w:tblPr>
+        <w:tblStyle w:val="TableGrid"/>
+        <w:tblW w:w="9360" w:type="dxa"/>
+      </w:tblPr>
+      <w:tr>
+        <w:tc>
+          <w:tcPr>
+            <w:shd w:val="clear" w:color="auto" w:fill="1F3864"/>
+          </w:tcPr>
+          <w:p>
+            <w:pPr>
+              <w:jc w:val="center"/>
+            </w:pPr>
+            <w:r>
+              <w:rPr>
+                <w:sz w:val="16"/>
+                <w:b/>
+              </w:rPr>
+              <w:t xml:space="preserve">Embedding</w:t>
+            </w:r>
+          </w:p>
+        </w:tc>
+        <w:tc>
+          <w:tcPr>
+            <w:shd w:val="clear" w:color="auto" w:fill="1F3864"/>
+          </w:tcPr>
+          <w:p>
+            <w:pPr>
+              <w:jc w:val="center"/>
+            </w:pPr>
+            <w:r>
+              <w:rPr>
+                <w:sz w:val="16"/>
+                <w:b/>
+              </w:rPr>
+              <w:t xml:space="preserve">Without Reranker</w:t>
+            </w:r>
+          </w:p>
+        </w:tc>
+        <w:tc>
+          <w:tcPr>
+            <w:shd w:val="clear" w:color="auto" w:fill="1F3864"/>
+          </w:tcPr>
+          <w:p>
+            <w:pPr>
+              <w:jc w:val="center"/>
+            </w:pPr>
+            <w:r>
+              <w:rPr>
+                <w:sz w:val="16"/>
+                <w:b/>
+              </w:rPr>
+              <w:t xml:space="preserve">Without Reranker</w:t>
+            </w:r>
+          </w:p>
+        </w:tc>
+        <w:tc>
+          <w:tcPr>
+            <w:shd w:val="clear" w:color="auto" w:fill="1F3864"/>
+          </w:tcPr>
+          <w:p>
+            <w:pPr>
+              <w:jc w:val="center"/>
+            </w:pPr>
+            <w:r>
+              <w:rPr>
+                <w:sz w:val="16"/>
+                <w:b/>
+              </w:rPr>
+              <w:t xml:space="preserve">bge-reranker-base</w:t>
+            </w:r>
+          </w:p>
+        </w:tc>
+        <w:tc>
+          <w:tcPr>
+            <w:shd w:val="clear" w:color="auto" w:fill="1F3864"/>
+          </w:tcPr>
+          <w:p>
+            <w:pPr>
+              <w:jc w:val="center"/>
+            </w:pPr>
+            <w:r>
+              <w:rPr>
+                <w:sz w:val="16"/>
+                <w:b/>
+              </w:rPr>
+              <w:t xml:space="preserve">bge-reranker-base</w:t>
+            </w:r>
+          </w:p>
+        </w:tc>
+        <w:tc>
+          <w:tcPr>
+            <w:shd w:val="clear" w:color="auto" w:fill="1F3864"/>
+          </w:tcPr>
+          <w:p>
+            <w:pPr>
+              <w:jc w:val="center"/>
+            </w:pPr>
+            <w:r>
+              <w:rPr>
+                <w:sz w:val="16"/>
+                <w:b/>
+              </w:rPr>
+              <w:t xml:space="preserve">bge-reranker-large</w:t>
+            </w:r>
+          </w:p>
+        </w:tc>
+        <w:tc>
+          <w:tcPr>
+            <w:shd w:val="clear" w:color="auto" w:fill="1F3864"/>
+          </w:tcPr>
+          <w:p>
+            <w:pPr>
+              <w:jc w:val="center"/>
+            </w:pPr>
+            <w:r>
+              <w:rPr>
+                <w:sz w:val="16"/>
+                <w:b/>
+              </w:rPr>
+              <w:t xml:space="preserve">bge-reranker-large</w:t>
+            </w:r>
+          </w:p>
+        </w:tc>
+        <w:tc>
+          <w:tcPr>
+            <w:shd w:val="clear" w:color="auto" w:fill="1F3864"/>
+          </w:tcPr>
+          <w:p>
+            <w:pPr>
+              <w:jc w:val="center"/>
+            </w:pPr>
+            <w:r>
+              <w:rPr>
+                <w:sz w:val="16"/>
+                <w:b/>
+              </w:rPr>
+              <w:t xml:space="preserve">Cohere-Reranker</w:t>
+            </w:r>
+          </w:p>
+        </w:tc>
+        <w:tc>
+          <w:tcPr>
+            <w:shd w:val="clear" w:color="auto" w:fill="1F3864"/>
+          </w:tcPr>
+          <w:p>
+            <w:pPr>
+              <w:jc w:val="center"/>
+            </w:pPr>
+            <w:r>
+              <w:rPr>
+                <w:sz w:val="16"/>
+                <w:b/>
+              </w:rPr>
+              <w:t xml:space="preserve">Cohere-Reranker</w:t>
+            </w:r>
+          </w:p>
+        </w:tc>
+      </w:tr>
+      <w:tr>
+        <w:tc>
+          <w:tcPr>
+            <w:shd w:val="clear" w:color="auto" w:fill="2E4057"/>
+          </w:tcPr>
+          <w:p>
+            <w:pPr>
+              <w:jc w:val="center"/>
+            </w:pPr>
+            <w:r>
+              <w:rPr>
+                <w:sz w:val="16"/>
+                <w:b/>
+              </w:rPr>
+              <w:t xml:space="preserve">Model</w:t>
+            </w:r>
+          </w:p>
+        </w:tc>
+        <w:tc>
+          <w:tcPr>
+            <w:shd w:val="clear" w:color="auto" w:fill="2E4057"/>
+          </w:tcPr>
+          <w:p>
+            <w:pPr>
+              <w:jc w:val="center"/>
+            </w:pPr>
+            <w:r>
+              <w:rPr>
+                <w:sz w:val="16"/>
+                <w:b/>
+              </w:rPr>
+              <w:t xml:space="preserve">Hit Rate</w:t>
+            </w:r>
+          </w:p>
+        </w:tc>
+        <w:tc>
+          <w:tcPr>
+            <w:shd w:val="clear" w:color="auto" w:fill="2E4057"/>
+          </w:tcPr>
+          <w:p>
+            <w:pPr>
+              <w:jc w:val="center"/>
+            </w:pPr>
+            <w:r>
+              <w:rPr>
+                <w:sz w:val="16"/>
+                <w:b/>
+              </w:rPr>
+              <w:t xml:space="preserve">MRR</w:t>
+            </w:r>
+          </w:p>
+        </w:tc>
+        <w:tc>
+          <w:tcPr>
+            <w:shd w:val="clear" w:color="auto" w:fill="2E4057"/>
+          </w:tcPr>
+          <w:p>
+            <w:pPr>
+              <w:jc w:val="center"/>
+            </w:pPr>
+            <w:r>
+              <w:rPr>
+                <w:sz w:val="16"/>
+                <w:b/>
+              </w:rPr>
+              <w:t xml:space="preserve">Hit Rate</w:t>
+            </w:r>
+          </w:p>
+        </w:tc>
+        <w:tc>
+          <w:tcPr>
+            <w:shd w:val="clear" w:color="auto" w:fill="2E4057"/>
+          </w:tcPr>
+          <w:p>
+            <w:pPr>
+              <w:jc w:val="center"/>
+            </w:pPr>
+            <w:r>
+              <w:rPr>
+                <w:sz w:val="16"/>
+                <w:b/>
+              </w:rPr>
+              <w:t xml:space="preserve">MRR</w:t>
+            </w:r>
+          </w:p>
+        </w:tc>
+        <w:tc>
+          <w:tcPr>
+            <w:shd w:val="clear" w:color="auto" w:fill="2E4057"/>
+          </w:tcPr>
+          <w:p>
+            <w:pPr>
+              <w:jc w:val="center"/>
+            </w:pPr>
+            <w:r>
+              <w:rPr>
+                <w:sz w:val="16"/>
+                <w:b/>
+              </w:rPr>
+              <w:t xml:space="preserve">Hit Rate</w:t>
+            </w:r>
+          </w:p>
+        </w:tc>
+        <w:tc>
+          <w:tcPr>
+            <w:shd w:val="clear" w:color="auto" w:fill="2E4057"/>
+          </w:tcPr>
+          <w:p>
+            <w:pPr>
+              <w:jc w:val="center"/>
+            </w:pPr>
+            <w:r>
+              <w:rPr>
+                <w:sz w:val="16"/>
+                <w:b/>
+              </w:rPr>
+              <w:t xml:space="preserve">MRR</w:t>
+            </w:r>
+          </w:p>
+        </w:tc>
+        <w:tc>
+          <w:tcPr>
+            <w:shd w:val="clear" w:color="auto" w:fill="2E4057"/>
+          </w:tcPr>
+          <w:p>
+            <w:pPr>
+              <w:jc w:val="center"/>
+            </w:pPr>
+            <w:r>
+              <w:rPr>
+                <w:sz w:val="16"/>
+                <w:b/>
+              </w:rPr>
+              <w:t xml:space="preserve">Hit Rate</w:t>
+            </w:r>
+          </w:p>
+        </w:tc>
+        <w:tc>
+          <w:tcPr>
+            <w:shd w:val="clear" w:color="auto" w:fill="2E4057"/>
+          </w:tcPr>
+          <w:p>
+            <w:pPr>
+              <w:jc w:val="center"/>
+            </w:pPr>
+            <w:r>
+              <w:rPr>
+                <w:sz w:val="16"/>
+                <w:b/>
+              </w:rPr>
+              <w:t xml:space="preserve">MRR</w:t>
+            </w:r>
+          </w:p>
+        </w:tc>
+      </w:tr>
+      <w:tr>
+        <w:tc>
+          <w:tcPr/>
+          <w:p>
+            <w:pPr>
+              <w:jc w:val="center"/>
+            </w:pPr>
+            <w:r>
+              <w:rPr>
+                <w:sz w:val="16"/>
+              </w:rPr>
+              <w:t xml:space="preserve">OpenAI</w:t>
+            </w:r>
+          </w:p>
+        </w:tc>
+        <w:tc>
+          <w:tcPr/>
+          <w:p>
+            <w:pPr>
+              <w:jc w:val="center"/>
+            </w:pPr>
+            <w:r>
+              <w:rPr>
+                <w:sz w:val="16"/>
+              </w:rPr>
+              <w:t xml:space="preserve">0.8764</w:t>
+            </w:r>
+          </w:p>
+        </w:tc>
+        <w:tc>
+          <w:tcPr/>
+          <w:p>
+            <w:pPr>
+              <w:jc w:val="center"/>
+            </w:pPr>
+            <w:r>
+              <w:rPr>
+                <w:sz w:val="16"/>
+              </w:rPr>
+              <w:t xml:space="preserve">0.7182</w:t>
+            </w:r>
+          </w:p>
+        </w:tc>
+        <w:tc>
+          <w:tcPr/>
+          <w:p>
+            <w:pPr>
+              <w:jc w:val="center"/>
+            </w:pPr>
+            <w:r>
+              <w:rPr>
+                <w:sz w:val="16"/>
+              </w:rPr>
+              <w:t xml:space="preserve">0.9157</w:t>
+            </w:r>
+          </w:p>
+        </w:tc>
+        <w:tc>
+          <w:tcPr/>
+          <w:p>
+            <w:pPr>
+              <w:jc w:val="center"/>
+            </w:pPr>
+            <w:r>
+              <w:rPr>
+                <w:sz w:val="16"/>
+              </w:rPr>
+              <w:t xml:space="preserve">0.8326</w:t>
+            </w:r>
+          </w:p>
+        </w:tc>
+        <w:tc>
+          <w:tcPr/>
+          <w:p>
+            <w:pPr>
+              <w:jc w:val="center"/>
+            </w:pPr>
+            <w:r>
+              <w:rPr>
+                <w:sz w:val="16"/>
+              </w:rPr>
+              <w:t xml:space="preserve">0.9101</w:t>
+            </w:r>
+          </w:p>
+        </w:tc>
+        <w:tc>
+          <w:tcPr/>
+          <w:p>
+            <w:pPr>
+              <w:jc w:val="center"/>
+            </w:pPr>
+            <w:r>
+              <w:rPr>
+                <w:sz w:val="16"/>
+              </w:rPr>
+              <w:t xml:space="preserve">0.8558</w:t>
+            </w:r>
+          </w:p>
+        </w:tc>
+        <w:tc>
+          <w:tcPr/>
+          <w:p>
+            <w:pPr>
+              <w:jc w:val="center"/>
+            </w:pPr>
+            <w:r>
+              <w:rPr>
+                <w:sz w:val="16"/>
+              </w:rPr>
+              <w:t xml:space="preserve">0.9270</w:t>
+            </w:r>
+          </w:p>
+        </w:tc>
+        <w:tc>
+          <w:tcPr/>
+          <w:p>
+            <w:pPr>
+              <w:jc w:val="center"/>
+            </w:pPr>
+            <w:r>
+              <w:rPr>
+                <w:sz w:val="16"/>
+              </w:rPr>
+              <w:t xml:space="preserve">0.8657</w:t>
+            </w:r>
+          </w:p>
+        </w:tc>
+      </w:tr>
+      <w:tr>
+        <w:tc>
+          <w:tcPr/>
+          <w:p>
+            <w:pPr>
+              <w:jc w:val="center"/>
+            </w:pPr>
+            <w:r>
+              <w:rPr>
+                <w:sz w:val="16"/>
+              </w:rPr>
+              <w:t xml:space="preserve">bge-large</w:t>
+            </w:r>
+          </w:p>
+        </w:tc>
+        <w:tc>
+          <w:tcPr/>
+          <w:p>
+            <w:pPr>
+              <w:jc w:val="center"/>
+            </w:pPr>
+            <w:r>
+              <w:rPr>
+                <w:sz w:val="16"/>
+              </w:rPr>
+              <w:t xml:space="preserve">0.7528</w:t>
+            </w:r>
+          </w:p>
+        </w:tc>
+        <w:tc>
+          <w:tcPr/>
+          <w:p>
+            <w:pPr>
+              <w:jc w:val="center"/>
+            </w:pPr>
+            <w:r>
+              <w:rPr>
+                <w:sz w:val="16"/>
+              </w:rPr>
+              <w:t xml:space="preserve">0.5972</w:t>
+            </w:r>
+          </w:p>
+        </w:tc>
+        <w:tc>
+          <w:tcPr/>
+          <w:p>
+            <w:pPr>
+              <w:jc w:val="center"/>
+            </w:pPr>
+            <w:r>
+              <w:rPr>
+                <w:sz w:val="16"/>
+              </w:rPr>
+              <w:t xml:space="preserve">0.8596</w:t>
+            </w:r>
+          </w:p>
+        </w:tc>
+        <w:tc>
+          <w:tcPr/>
+          <w:p>
+            <w:pPr>
+              <w:jc w:val="center"/>
+            </w:pPr>
+            <w:r>
+              <w:rPr>
+                <w:sz w:val="16"/>
+              </w:rPr>
+              <w:t xml:space="preserve">0.8052</w:t>
+            </w:r>
+          </w:p>
+        </w:tc>
+        <w:tc>
+          <w:tcPr/>
+          <w:p>
+            <w:pPr>
+              <w:jc w:val="center"/>
+            </w:pPr>
+            <w:r>
+              <w:rPr>
+                <w:sz w:val="16"/>
+              </w:rPr>
+              <w:t xml:space="preserve">0.8652</w:t>
+            </w:r>
+          </w:p>
+        </w:tc>
+        <w:tc>
+          <w:tcPr/>
+          <w:p>
+            <w:pPr>
+              <w:jc w:val="center"/>
+            </w:pPr>
+            <w:r>
+              <w:rPr>
+                <w:sz w:val="16"/>
+              </w:rPr>
+              <w:t xml:space="preserve">0.8160</w:t>
+            </w:r>
+          </w:p>
+        </w:tc>
+        <w:tc>
+          <w:tcPr/>
+          <w:p>
+            <w:pPr>
+              <w:jc w:val="center"/>
+            </w:pPr>
+            <w:r>
+              <w:rPr>
+                <w:sz w:val="16"/>
+              </w:rPr>
+              <w:t xml:space="preserve">0.8764</w:t>
+            </w:r>
+          </w:p>
+        </w:tc>
+        <w:tc>
+          <w:tcPr/>
+          <w:p>
+            <w:pPr>
+              <w:jc w:val="center"/>
+            </w:pPr>
+            <w:r>
+              <w:rPr>
+                <w:sz w:val="16"/>
+              </w:rPr>
+              <w:t xml:space="preserve">0.8228</w:t>
+            </w:r>
+          </w:p>
+        </w:tc>
+      </w:tr>
+      <w:tr>
+        <w:tc>
+          <w:tcPr/>
+          <w:p>
+            <w:pPr>
+              <w:jc w:val="center"/>
+            </w:pPr>
+            <w:r>
+              <w:rPr>
+                <w:sz w:val="16"/>
+              </w:rPr>
+              <w:t xml:space="preserve">llm-embedder</w:t>
+            </w:r>
+          </w:p>
+        </w:tc>
+        <w:tc>
+          <w:tcPr/>
+          <w:p>
+            <w:pPr>
+              <w:jc w:val="center"/>
+            </w:pPr>
+            <w:r>
+              <w:rPr>
+                <w:sz w:val="16"/>
+              </w:rPr>
+              <w:t xml:space="preserve">0.8146</w:t>
+            </w:r>
+          </w:p>
+        </w:tc>
+        <w:tc>
+          <w:tcPr/>
+          <w:p>
+            <w:pPr>
+              <w:jc w:val="center"/>
+            </w:pPr>
+            <w:r>
+              <w:rPr>
+                <w:sz w:val="16"/>
+              </w:rPr>
+              <w:t xml:space="preserve">0.5873</w:t>
+            </w:r>
+          </w:p>
+        </w:tc>
+        <w:tc>
+          <w:tcPr/>
+          <w:p>
+            <w:pPr>
+              <w:jc w:val="center"/>
+            </w:pPr>
+            <w:r>
+              <w:rPr>
+                <w:sz w:val="16"/>
+              </w:rPr>
+              <w:t xml:space="preserve">0.8708</w:t>
+            </w:r>
+          </w:p>
+        </w:tc>
+        <w:tc>
+          <w:tcPr/>
+          <w:p>
+            <w:pPr>
+              <w:jc w:val="center"/>
+            </w:pPr>
+            <w:r>
+              <w:rPr>
+                <w:sz w:val="16"/>
+              </w:rPr>
+              <w:t xml:space="preserve">0.8031</w:t>
+            </w:r>
+          </w:p>
+        </w:tc>
+        <w:tc>
+          <w:tcPr/>
+          <w:p>
+            <w:pPr>
+              <w:jc w:val="center"/>
+            </w:pPr>
+            <w:r>
+              <w:rPr>
+                <w:sz w:val="16"/>
+              </w:rPr>
+              <w:t xml:space="preserve">0.8764</w:t>
+            </w:r>
+          </w:p>
+        </w:tc>
+        <w:tc>
+          <w:tcPr/>
+          <w:p>
+            <w:pPr>
+              <w:jc w:val="center"/>
+            </w:pPr>
+            <w:r>
+              <w:rPr>
+                <w:sz w:val="16"/>
+              </w:rPr>
+              <w:t xml:space="preserve">0.8246</w:t>
+            </w:r>
+          </w:p>
+        </w:tc>
+        <w:tc>
+          <w:tcPr/>
+          <w:p>
+            <w:pPr>
+              <w:jc w:val="center"/>
+            </w:pPr>
+            <w:r>
+              <w:rPr>
+                <w:sz w:val="16"/>
+              </w:rPr>
+              <w:t xml:space="preserve">0.8820</w:t>
+            </w:r>
+          </w:p>
+        </w:tc>
+        <w:tc>
+          <w:tcPr/>
+          <w:p>
+            <w:pPr>
+              <w:jc w:val="center"/>
+            </w:pPr>
+            <w:r>
+              <w:rPr>
+                <w:sz w:val="16"/>
+              </w:rPr>
+              <w:t xml:space="preserve">0.8302</w:t>
+            </w:r>
+          </w:p>
+        </w:tc>
+      </w:tr>
+      <w:tr>
+        <w:tc>
+          <w:tcPr/>
+          <w:p>
+            <w:pPr>
+              <w:jc w:val="center"/>
+            </w:pPr>
+            <w:r>
+              <w:rPr>
+                <w:sz w:val="16"/>
+              </w:rPr>
+              <w:t xml:space="preserve">Cohere-v2</w:t>
+            </w:r>
+          </w:p>
+        </w:tc>
+        <w:tc>
+          <w:tcPr/>
+          <w:p>
+            <w:pPr>
+              <w:jc w:val="center"/>
+            </w:pPr>
+            <w:r>
+              <w:rPr>
+                <w:sz w:val="16"/>
+              </w:rPr>
+              <w:t xml:space="preserve">0.7809</w:t>
+            </w:r>
+          </w:p>
+        </w:tc>
+        <w:tc>
+          <w:tcPr/>
+          <w:p>
+            <w:pPr>
+              <w:jc w:val="center"/>
+            </w:pPr>
+            <w:r>
+              <w:rPr>
+                <w:sz w:val="16"/>
+              </w:rPr>
+              <w:t xml:space="preserve">0.5705</w:t>
+            </w:r>
+          </w:p>
+        </w:tc>
+        <w:tc>
+          <w:tcPr/>
+          <w:p>
+            <w:pPr>
+              <w:jc w:val="center"/>
+            </w:pPr>
+            <w:r>
+              <w:rPr>
+                <w:sz w:val="16"/>
+              </w:rPr>
+              <w:t xml:space="preserve">0.8764</w:t>
+            </w:r>
+          </w:p>
+        </w:tc>
+        <w:tc>
+          <w:tcPr/>
+          <w:p>
+            <w:pPr>
+              <w:jc w:val="center"/>
+            </w:pPr>
+            <w:r>
+              <w:rPr>
+                <w:sz w:val="16"/>
+              </w:rPr>
+              <w:t xml:space="preserve">0.7981</w:t>
+            </w:r>
+          </w:p>
+        </w:tc>
+        <w:tc>
+          <w:tcPr/>
+          <w:p>
+            <w:pPr>
+              <w:jc w:val="center"/>
+            </w:pPr>
+            <w:r>
+              <w:rPr>
+                <w:sz w:val="16"/>
+              </w:rPr>
+              <w:t xml:space="preserve">0.8764</w:t>
+            </w:r>
+          </w:p>
+        </w:tc>
+        <w:tc>
+          <w:tcPr/>
+          <w:p>
+            <w:pPr>
+              <w:jc w:val="center"/>
+            </w:pPr>
+            <w:r>
+              <w:rPr>
+                <w:sz w:val="16"/>
+              </w:rPr>
+              <w:t xml:space="preserve">0.8253</w:t>
+            </w:r>
+          </w:p>
+        </w:tc>
+        <w:tc>
+          <w:tcPr/>
+          <w:p>
+            <w:pPr>
+              <w:jc w:val="center"/>
+            </w:pPr>
+            <w:r>
+              <w:rPr>
+                <w:sz w:val="16"/>
+              </w:rPr>
+              <w:t xml:space="preserve">0.8764</w:t>
+            </w:r>
+          </w:p>
+        </w:tc>
+        <w:tc>
+          <w:tcPr/>
+          <w:p>
+            <w:pPr>
+              <w:jc w:val="center"/>
+            </w:pPr>
+            <w:r>
+              <w:rPr>
+                <w:sz w:val="16"/>
+              </w:rPr>
+              <w:t xml:space="preserve">0.8155</w:t>
+            </w:r>
+          </w:p>
+        </w:tc>
+      </w:tr>
+      <w:tr>
+        <w:tc>
+          <w:tcPr/>
+          <w:p>
+            <w:pPr>
+              <w:jc w:val="center"/>
+            </w:pPr>
+            <w:r>
+              <w:rPr>
+                <w:sz w:val="16"/>
+              </w:rPr>
+              <w:t xml:space="preserve">Cohere-v3</w:t>
+            </w:r>
+          </w:p>
+        </w:tc>
+        <w:tc>
+          <w:tcPr/>
+          <w:p>
+            <w:pPr>
+              <w:jc w:val="center"/>
+            </w:pPr>
+            <w:r>
+              <w:rPr>
+                <w:sz w:val="16"/>
+              </w:rPr>
+              <w:t xml:space="preserve">0.8258</w:t>
+            </w:r>
+          </w:p>
+        </w:tc>
+        <w:tc>
+          <w:tcPr/>
+          <w:p>
+            <w:pPr>
+              <w:jc w:val="center"/>
+            </w:pPr>
+            <w:r>
+              <w:rPr>
+                <w:sz w:val="16"/>
+              </w:rPr>
+              <w:t xml:space="preserve">0.6245</w:t>
+            </w:r>
+          </w:p>
+        </w:tc>
+        <w:tc>
+          <w:tcPr/>
+          <w:p>
+            <w:pPr>
+              <w:jc w:val="center"/>
+            </w:pPr>
+            <w:r>
+              <w:rPr>
+                <w:sz w:val="16"/>
+              </w:rPr>
+              <w:t xml:space="preserve">0.8820</w:t>
+            </w:r>
+          </w:p>
+        </w:tc>
+        <w:tc>
+          <w:tcPr/>
+          <w:p>
+            <w:pPr>
+              <w:jc w:val="center"/>
+            </w:pPr>
+            <w:r>
+              <w:rPr>
+                <w:sz w:val="16"/>
+              </w:rPr>
+              <w:t xml:space="preserve">0.8061</w:t>
+            </w:r>
+          </w:p>
+        </w:tc>
+        <w:tc>
+          <w:tcPr/>
+          <w:p>
+            <w:pPr>
+              <w:jc w:val="center"/>
+            </w:pPr>
+            <w:r>
+              <w:rPr>
+                <w:sz w:val="16"/>
+              </w:rPr>
+              <w:t xml:space="preserve">0.8820</w:t>
+            </w:r>
+          </w:p>
+        </w:tc>
+        <w:tc>
+          <w:tcPr/>
+          <w:p>
+            <w:pPr>
+              <w:jc w:val="center"/>
+            </w:pPr>
+            <w:r>
+              <w:rPr>
+                <w:sz w:val="16"/>
+              </w:rPr>
+              <w:t xml:space="preserve">0.8346</w:t>
+            </w:r>
+          </w:p>
+        </w:tc>
+        <w:tc>
+          <w:tcPr/>
+          <w:p>
+            <w:pPr>
+              <w:jc w:val="center"/>
+            </w:pPr>
+            <w:r>
+              <w:rPr>
+                <w:sz w:val="16"/>
+              </w:rPr>
+              <w:t xml:space="preserve">0.8876</w:t>
+            </w:r>
+          </w:p>
+        </w:tc>
+        <w:tc>
+          <w:tcPr/>
+          <w:p>
+            <w:pPr>
+              <w:jc w:val="center"/>
+            </w:pPr>
+            <w:r>
+              <w:rPr>
+                <w:sz w:val="16"/>
+              </w:rPr>
+              <w:t xml:space="preserve">0.8360</w:t>
+            </w:r>
+          </w:p>
+        </w:tc>
+      </w:tr>
+      <w:tr>
+        <w:tc>
+          <w:tcPr/>
+          <w:p>
+            <w:pPr>
+              <w:jc w:val="center"/>
+            </w:pPr>
+            <w:r>
+              <w:rPr>
+                <w:sz w:val="16"/>
+              </w:rPr>
+              <w:t xml:space="preserve">Voyage</w:t>
+            </w:r>
+          </w:p>
+        </w:tc>
+        <w:tc>
+          <w:tcPr/>
+          <w:p>
+            <w:pPr>
+              <w:jc w:val="center"/>
+            </w:pPr>
+            <w:r>
+              <w:rPr>
+                <w:sz w:val="16"/>
+              </w:rPr>
+              <w:t xml:space="preserve">0.8315</w:t>
+            </w:r>
+          </w:p>
+        </w:tc>
+        <w:tc>
+          <w:tcPr/>
+          <w:p>
+            <w:pPr>
+              <w:jc w:val="center"/>
+            </w:pPr>
+            <w:r>
+              <w:rPr>
+                <w:sz w:val="16"/>
+              </w:rPr>
+              <w:t xml:space="preserve">0.6874</w:t>
+            </w:r>
+          </w:p>
+        </w:tc>
+        <w:tc>
+          <w:tcPr/>
+          <w:p>
+            <w:pPr>
+              <w:jc w:val="center"/>
+            </w:pPr>
+            <w:r>
+              <w:rPr>
+                <w:sz w:val="16"/>
+              </w:rPr>
+              <w:t xml:space="preserve">0.9270</w:t>
+            </w:r>
+          </w:p>
+        </w:tc>
+        <w:tc>
+          <w:tcPr/>
+          <w:p>
+            <w:pPr>
+              <w:jc w:val="center"/>
+            </w:pPr>
+            <w:r>
+              <w:rPr>
+                <w:sz w:val="16"/>
+              </w:rPr>
+              <w:t xml:space="preserve">0.8372</w:t>
+            </w:r>
+          </w:p>
+        </w:tc>
+        <w:tc>
+          <w:tcPr/>
+          <w:p>
+            <w:pPr>
+              <w:jc w:val="center"/>
+            </w:pPr>
+            <w:r>
+              <w:rPr>
+                <w:sz w:val="16"/>
+              </w:rPr>
+              <w:t xml:space="preserve">0.9157</w:t>
+            </w:r>
+          </w:p>
+        </w:tc>
+        <w:tc>
+          <w:tcPr/>
+          <w:p>
+            <w:pPr>
+              <w:jc w:val="center"/>
+            </w:pPr>
+            <w:r>
+              <w:rPr>
+                <w:sz w:val="16"/>
+              </w:rPr>
+              <w:t xml:space="preserve">0.8586</w:t>
+            </w:r>
+          </w:p>
+        </w:tc>
+        <w:tc>
+          <w:tcPr/>
+          <w:p>
+            <w:pPr>
+              <w:jc w:val="center"/>
+            </w:pPr>
+            <w:r>
+              <w:rPr>
+                <w:sz w:val="16"/>
+              </w:rPr>
+              <w:t xml:space="preserve">0.9157</w:t>
+            </w:r>
+          </w:p>
+        </w:tc>
+        <w:tc>
+          <w:tcPr/>
+          <w:p>
+            <w:pPr>
+              <w:jc w:val="center"/>
+            </w:pPr>
+            <w:r>
+              <w:rPr>
+                <w:sz w:val="16"/>
+              </w:rPr>
+              <w:t xml:space="preserve">0.8512</w:t>
+            </w:r>
+          </w:p>
+        </w:tc>
+      </w:tr>
+      <w:tr>
+        <w:tc>
+          <w:tcPr/>
+          <w:p>
+            <w:pPr>
+              <w:jc w:val="center"/>
+            </w:pPr>
+            <w:r>
+              <w:rPr>
+                <w:sz w:val="16"/>
+              </w:rPr>
+              <w:t xml:space="preserve">JinaAI-Small</w:t>
+            </w:r>
+          </w:p>
+        </w:tc>
+        <w:tc>
+          <w:tcPr/>
+          <w:p>
+            <w:pPr>
+              <w:jc w:val="center"/>
+            </w:pPr>
+            <w:r>
+              <w:rPr>
+                <w:sz w:val="16"/>
+              </w:rPr>
+              <w:t xml:space="preserve">0.8315</w:t>
+            </w:r>
+          </w:p>
+        </w:tc>
+        <w:tc>
+          <w:tcPr/>
+          <w:p>
+            <w:pPr>
+              <w:jc w:val="center"/>
+            </w:pPr>
+            <w:r>
+              <w:rPr>
+                <w:sz w:val="16"/>
+              </w:rPr>
+              <w:t xml:space="preserve">0.6140</w:t>
+            </w:r>
+          </w:p>
+        </w:tc>
+        <w:tc>
+          <w:tcPr/>
+          <w:p>
+            <w:pPr>
+              <w:jc w:val="center"/>
+            </w:pPr>
+            <w:r>
+              <w:rPr>
+                <w:sz w:val="16"/>
+              </w:rPr>
+              <w:t xml:space="preserve">0.9157</w:t>
+            </w:r>
+          </w:p>
+        </w:tc>
+        <w:tc>
+          <w:tcPr/>
+          <w:p>
+            <w:pPr>
+              <w:jc w:val="center"/>
+            </w:pPr>
+            <w:r>
+              <w:rPr>
+                <w:sz w:val="16"/>
+              </w:rPr>
+              <w:t xml:space="preserve">0.8431</w:t>
+            </w:r>
+          </w:p>
+        </w:tc>
+        <w:tc>
+          <w:tcPr/>
+          <w:p>
+            <w:pPr>
+              <w:jc w:val="center"/>
+            </w:pPr>
+            <w:r>
+              <w:rPr>
+                <w:sz w:val="16"/>
+              </w:rPr>
+              <w:t xml:space="preserve">0.9270</w:t>
+            </w:r>
+          </w:p>
+        </w:tc>
+        <w:tc>
+          <w:tcPr/>
+          <w:p>
+            <w:pPr>
+              <w:jc w:val="center"/>
+            </w:pPr>
+            <w:r>
+              <w:rPr>
+                <w:sz w:val="16"/>
+              </w:rPr>
+              <w:t xml:space="preserve">0.8573</w:t>
+            </w:r>
+          </w:p>
+        </w:tc>
+        <w:tc>
+          <w:tcPr/>
+          <w:p>
+            <w:pPr>
+              <w:jc w:val="center"/>
+            </w:pPr>
+            <w:r>
+              <w:rPr>
+                <w:sz w:val="16"/>
+              </w:rPr>
+              <w:t xml:space="preserve">0.9270</w:t>
+            </w:r>
+          </w:p>
+        </w:tc>
+        <w:tc>
+          <w:tcPr/>
+          <w:p>
+            <w:pPr>
+              <w:jc w:val="center"/>
+            </w:pPr>
+            <w:r>
+              <w:rPr>
+                <w:sz w:val="16"/>
+              </w:rPr>
+              <w:t xml:space="preserve">0.8686</w:t>
+            </w:r>
+          </w:p>
+        </w:tc>
+      </w:tr>
+      <w:tr>
+        <w:tc>
+          <w:tcPr/>
+          <w:p>
+            <w:pPr>
+              <w:jc w:val="center"/>
+            </w:pPr>
+            <w:r>
+              <w:rPr>
+                <w:sz w:val="16"/>
+              </w:rPr>
+              <w:t xml:space="preserve">JinaAI-Base</w:t>
+            </w:r>
+          </w:p>
+        </w:tc>
+        <w:tc>
+          <w:tcPr/>
+          <w:p>
+            <w:pPr>
+              <w:jc w:val="center"/>
+            </w:pPr>
+            <w:r>
+              <w:rPr>
+                <w:sz w:val="16"/>
+              </w:rPr>
+              <w:t xml:space="preserve">0.8483</w:t>
+            </w:r>
+          </w:p>
+        </w:tc>
+        <w:tc>
+          <w:tcPr/>
+          <w:p>
+            <w:pPr>
+              <w:jc w:val="center"/>
+            </w:pPr>
+            <w:r>
+              <w:rPr>
+                <w:sz w:val="16"/>
+              </w:rPr>
+              <w:t xml:space="preserve">0.6822</w:t>
+            </w:r>
+          </w:p>
+        </w:tc>
+        <w:tc>
+          <w:tcPr/>
+          <w:p>
+            <w:pPr>
+              <w:jc w:val="center"/>
+            </w:pPr>
+            <w:r>
+              <w:rPr>
+                <w:sz w:val="16"/>
+              </w:rPr>
+              <w:t xml:space="preserve">0.9382</w:t>
+            </w:r>
+          </w:p>
+        </w:tc>
+        <w:tc>
+          <w:tcPr/>
+          <w:p>
+            <w:pPr>
+              <w:jc w:val="center"/>
+            </w:pPr>
+            <w:r>
+              <w:rPr>
+                <w:sz w:val="16"/>
+              </w:rPr>
+              <w:t xml:space="preserve">0.8463</w:t>
+            </w:r>
+          </w:p>
+        </w:tc>
+        <w:tc>
+          <w:tcPr/>
+          <w:p>
+            <w:pPr>
+              <w:jc w:val="center"/>
+            </w:pPr>
+            <w:r>
+              <w:rPr>
+                <w:sz w:val="16"/>
+              </w:rPr>
+              <w:t xml:space="preserve">0.9382</w:t>
+            </w:r>
+          </w:p>
+        </w:tc>
+        <w:tc>
+          <w:tcPr/>
+          <w:p>
+            <w:pPr>
+              <w:jc w:val="center"/>
+            </w:pPr>
+            <w:r>
+              <w:rPr>
+                <w:sz w:val="16"/>
+              </w:rPr>
+              <w:t xml:space="preserve">0.8685</w:t>
+            </w:r>
+          </w:p>
+        </w:tc>
+        <w:tc>
+          <w:tcPr/>
+          <w:p>
+            <w:pPr>
+              <w:jc w:val="center"/>
+            </w:pPr>
+            <w:r>
+              <w:rPr>
+                <w:sz w:val="16"/>
+              </w:rPr>
+              <w:t xml:space="preserve">0.9326</w:t>
+            </w:r>
+          </w:p>
+        </w:tc>
+        <w:tc>
+          <w:tcPr/>
+          <w:p>
+            <w:pPr>
+              <w:jc w:val="center"/>
+            </w:pPr>
+            <w:r>
+              <w:rPr>
+                <w:sz w:val="16"/>
+              </w:rPr>
+              <w:t xml:space="preserve">0.8737</w:t>
+            </w:r>
+          </w:p>
+        </w:tc>
+      </w:tr>
+      <w:tr>
+        <w:tc>
+          <w:tcPr/>
+          <w:p>
+            <w:pPr>
+              <w:jc w:val="center"/>
+            </w:pPr>
+            <w:r>
+              <w:rPr>
+                <w:sz w:val="16"/>
+              </w:rPr>
+              <w:t xml:space="preserve">Google-PaLM</w:t>
+            </w:r>
+          </w:p>
+        </w:tc>
+        <w:tc>
+          <w:tcPr/>
+          <w:p>
+            <w:pPr>
+              <w:jc w:val="center"/>
+            </w:pPr>
+            <w:r>
+              <w:rPr>
+                <w:sz w:val="16"/>
+              </w:rPr>
+              <w:t xml:space="preserve">0.8652</w:t>
+            </w:r>
+          </w:p>
+        </w:tc>
+        <w:tc>
+          <w:tcPr/>
+          <w:p>
+            <w:pPr>
+              <w:jc w:val="center"/>
+            </w:pPr>
+            <w:r>
+              <w:rPr>
+                <w:sz w:val="16"/>
+              </w:rPr>
+              <w:t xml:space="preserve">0.7195</w:t>
+            </w:r>
+          </w:p>
+        </w:tc>
+        <w:tc>
+          <w:tcPr/>
+          <w:p>
+            <w:pPr>
+              <w:jc w:val="center"/>
+            </w:pPr>
+            <w:r>
+              <w:rPr>
+                <w:sz w:val="16"/>
+              </w:rPr>
+              <w:t xml:space="preserve">0.9101</w:t>
+            </w:r>
+          </w:p>
+        </w:tc>
+        <w:tc>
+          <w:tcPr/>
+          <w:p>
+            <w:pPr>
+              <w:jc w:val="center"/>
+            </w:pPr>
+            <w:r>
+              <w:rPr>
+                <w:sz w:val="16"/>
+              </w:rPr>
+              <w:t xml:space="preserve">0.8337</w:t>
+            </w:r>
+          </w:p>
+        </w:tc>
+        <w:tc>
+          <w:tcPr/>
+          <w:p>
+            <w:pPr>
+              <w:jc w:val="center"/>
+            </w:pPr>
+            <w:r>
+              <w:rPr>
+                <w:sz w:val="16"/>
+              </w:rPr>
+              <w:t xml:space="preserve">0.9101</w:t>
+            </w:r>
+          </w:p>
+        </w:tc>
+        <w:tc>
+          <w:tcPr/>
+          <w:p>
+            <w:pPr>
+              <w:jc w:val="center"/>
+            </w:pPr>
+            <w:r>
+              <w:rPr>
+                <w:sz w:val="16"/>
+              </w:rPr>
+              <w:t xml:space="preserve">0.8531</w:t>
+            </w:r>
+          </w:p>
+        </w:tc>
+        <w:tc>
+          <w:tcPr/>
+          <w:p>
+            <w:pPr>
+              <w:jc w:val="center"/>
+            </w:pPr>
+            <w:r>
+              <w:rPr>
+                <w:sz w:val="16"/>
+              </w:rPr>
+              <w:t xml:space="preserve">0.9101</w:t>
+            </w:r>
+          </w:p>
+        </w:tc>
+        <w:tc>
+          <w:tcPr/>
+          <w:p>
+            <w:pPr>
+              <w:jc w:val="center"/>
+            </w:pPr>
+            <w:r>
+              <w:rPr>
+                <w:sz w:val="16"/>
+              </w:rPr>
+              <w:t xml:space="preserve">0.8557</w:t>
+            </w:r>
+          </w:p>
+        </w:tc>
+      </w:tr>
+    </w:tbl>
+    <w:p>
+      <w:r>
+        <w:t xml:space="preserve">Table: Reranker benchmark — Hit Rate and MRR across embedding models (source: LlamaIndex, 2023). Higher values indicate better retrieval performance. Results consistently show that reranking improves both metrics across all embedding models tested.</w:t>
+      </w:r>
+    </w:p>
+    <w:p>
+      <w:r>
+        <w:t xml:space="preserve">Despite these documented performance gains, reranking was not incorporated into the current system for the following reasons: (1) Reranking models such as bge-reranker and Cohere Rerank are relatively new components not yet fully supported within the version of LangChain used in this project, introducing integration risk beyond the team's current expertise; (2) adding a reranker introduces an additional inference step that increases response latency, which must be re-evaluated against the ≤3-second performance target; and (3) the current RAG pipeline already achieves 86.4% alignment on domain-specific fraud cases without reranking, suggesting that reranking would offer marginal rather than transformative improvement at this stage. Reranking is recommended as a high-priority enhancement for future development, particularly if the knowledge base grows beyond the current 606-article corpus and retrieval precision becomes a bottleneck.</w:t>
+      </w:r>
+    </w:p>
+    <w:p>
+      <w:pPr>
         <w:pStyle w:val="Heading2"/>
       </w:pPr>
       <w:bookmarkStart w:id="50" w:name="_Toc221570373"/>
@@ -11417,6 +12913,32 @@
           <w:lang w:val="en-HK"/>
         </w:rPr>
       </w:pPr>
+    </w:p>
+    <w:p>
+      <w:pPr>
+        <w:pStyle w:val="Heading3"/>
+      </w:pPr>
+      <w:r>
+        <w:t xml:space="preserve">Absence of Native Mobile Application</w:t>
+      </w:r>
+    </w:p>
+    <w:p>
+      <w:r>
+        <w:t xml:space="preserve">The project does not include a native mobile application (iOS or Android). This is attributable to two practical constraints. First, the team is enrolled in the HD in Data Science and AI programme rather than a mobile or software engineering programme; native app development—encompassing platform-specific SDKs, UI frameworks, and App Store submission processes—falls outside the team's core academic specialisation. Second, the eight-month project timeline, combined with the technical complexity of implementing and validating the core RAG pipeline, left insufficient time to develop, test, and deploy a production-grade mobile application. The team instead prioritised a WhatsApp-based conversational interface (deployed in April 2026), which provides a practical and accessible channel for Hong Kong residents without requiring any application installation. A dedicated mobile application remains a recommended direction for future development teams with appropriate mobile engineering expertise.</w:t>
+      </w:r>
+    </w:p>
+    <w:p>
+      <w:pPr>
+        <w:pStyle w:val="Heading3"/>
+      </w:pPr>
+      <w:r>
+        <w:t xml:space="preserve">Scarcity of Labeled Fraud Datasets in Hong Kong</w:t>
+      </w:r>
+    </w:p>
+    <w:p>
+      <w:r>
+        <w:t xml:space="preserve">A significant constraint encountered during this project is the near-total absence of publicly available, labeled fraud datasets specific to the Hong Kong context. Unlike general-purpose NLP benchmarks or financial fraud datasets from Western markets, labeled corpora of Hong Kong scam communications—annotated with fraud probability, scam type, and victim outcome—do not exist in the public domain. This scarcity is not accidental: releasing labeled fraud datasets creates an inherent dual-use risk. Fraudsters can analyse labeled examples to understand precisely which linguistic patterns, authority cues, and urgency triggers trigger detection, then adapt their scripts to evade detection systems—effectively using the dataset as a training resource to improve their own techniques. This adversarial concern is widely acknowledged in the fraud detection research community (Bagwe, 2024; FraudFights, 2023) and is especially acute in Hong Kong, where scam tactics are already documented to evolve within 72 hours of initial detection (HK01 Fraud Intelligence Unit, 2026). Consequently, this project relies on unlabeled news articles (HK01) as its knowledge base, with manual annotation limited to a validation set of 85 cases used for internal performance evaluation. Future work should explore secure, privacy-preserving dataset curation in partnership with law enforcement agencies such as the Anti-Deception Coordination Centre (ADCC) and Hong Kong Police Force (HKPF), under controlled access conditions that prevent misuse by malicious actors.</w:t>
+      </w:r>
     </w:p>
     <w:p>
       <w:pPr>
@@ -20886,6 +22408,66 @@
           </w:p>
         </w:tc>
       </w:tr>
+      <w:tr>
+        <w:tc>
+          <w:tcPr>
+            <w:tcW w:w="1356" w:type="dxa"/>
+            <w:hideMark/>
+          </w:tcPr>
+          <w:p>
+            <w:r>
+              <w:rPr>
+                <w:b/>
+              </w:rPr>
+              <w:t xml:space="preserve">AI Assistant (ChatGPT / DeepSeek / Claude)</w:t>
+            </w:r>
+          </w:p>
+        </w:tc>
+        <w:tc>
+          <w:tcPr>
+            <w:tcW w:w="1458" w:type="dxa"/>
+            <w:hideMark/>
+          </w:tcPr>
+          <w:p>
+            <w:r>
+              <w:rPr>
+                <w:b/>
+              </w:rPr>
+              <w:t xml:space="preserve">AI Team Member (per IVE FYP AY25/26 guidelines)</w:t>
+            </w:r>
+          </w:p>
+        </w:tc>
+        <w:tc>
+          <w:tcPr>
+            <w:tcW w:w="4531" w:type="dxa"/>
+            <w:hideMark/>
+          </w:tcPr>
+          <w:p>
+            <w:r>
+              <w:t xml:space="preserve">Report drafting support and proofreading (grammar, structure, academic tone)
+Literature review synthesis and citation verification
+Code explanation and debugging assistance (LangChain, ChromaDB, BeautifulSoup)
+Prompt design for DeepSeek-v3.2 RAG pipeline
+Constraint justification and risk analysis drafting
+Translation assistance between Chinese and English documentation</w:t>
+            </w:r>
+          </w:p>
+        </w:tc>
+        <w:tc>
+          <w:tcPr>
+            <w:tcW w:w="1899" w:type="dxa"/>
+            <w:hideMark/>
+          </w:tcPr>
+          <w:p>
+            <w:r>
+              <w:t xml:space="preserve">Revised interim report draft (AI-assisted language polish)
+Prompt templates used in main.ipynb
+Sections of constraint analysis and limitation documentation
+Code commentary and inline documentation improvements</w:t>
+            </w:r>
+          </w:p>
+        </w:tc>
+      </w:tr>
     </w:tbl>
     <w:p>
       <w:pPr>
@@ -20946,6 +22528,9 @@
           <w:lang w:val="en-HK" w:eastAsia="zh-CN"/>
         </w:rPr>
         <w:t xml:space="preserve">Per ITP4870M Guidelines Section 5.4, this project transparently documents both team composition changes </w:t>
+        <w:br/>
+        <w:br/>
+        <w:t>In accordance with IVE FYP AY25/26 guidelines, this group formally acknowledges AI tools as a contributing team member. Generative AI assistants (including ChatGPT, DeepSeek, and Claude) were used for report drafting, proofreading, prompt design, code explanation, and constraint analysis. All AI-generated content was reviewed, verified, and edited by human team members before inclusion in any submitted deliverable. The specific contributions of the AI member are itemised in the Work Distribution table above.</w:t>
       </w:r>
       <w:r>
         <w:rPr>

</xml_diff>

<commit_message>
Rebuild reranking table with exact image values and colour highlights (orange/red/green)
Agent-Logs-Url: https://github.com/Jendope/ideal-octo-parakeet/sessions/9e5841b4-dfcb-4354-9dcf-641c223aaa4c

Co-authored-by: Jendope <158296725+Jendope@users.noreply.github.com>
</commit_message>
<xml_diff>
--- a/interim-report-revised.docx
+++ b/interim-report-revised.docx
@@ -10388,6 +10388,17 @@
         <w:tblStyle w:val="TableGrid"/>
         <w:tblW w:w="9360" w:type="dxa"/>
       </w:tblPr>
+      <w:tblGrid>
+        <w:gridCol w:w="1400"/>
+        <w:gridCol w:w="900"/>
+        <w:gridCol w:w="900"/>
+        <w:gridCol w:w="900"/>
+        <w:gridCol w:w="900"/>
+        <w:gridCol w:w="900"/>
+        <w:gridCol w:w="900"/>
+        <w:gridCol w:w="900"/>
+        <w:gridCol w:w="900"/>
+      </w:tblGrid>
       <w:tr>
         <w:tc>
           <w:tcPr>
@@ -10399,8 +10410,10 @@
             </w:pPr>
             <w:r>
               <w:rPr>
-                <w:sz w:val="16"/>
+                <w:sz w:val="18"/>
+                <w:szCs w:val="18"/>
                 <w:b/>
+                <w:color w:val="FFFFFF"/>
               </w:rPr>
               <w:t xml:space="preserve">Embedding</w:t>
             </w:r>
@@ -10408,7 +10421,8 @@
         </w:tc>
         <w:tc>
           <w:tcPr>
-            <w:shd w:val="clear" w:color="auto" w:fill="1F3864"/>
+            <w:shd w:val="clear" w:color="auto" w:fill="2E4057"/>
+            <w:gridSpan w:val="2"/>
           </w:tcPr>
           <w:p>
             <w:pPr>
@@ -10416,16 +10430,19 @@
             </w:pPr>
             <w:r>
               <w:rPr>
-                <w:sz w:val="16"/>
+                <w:sz w:val="18"/>
+                <w:szCs w:val="18"/>
                 <w:b/>
-              </w:rPr>
-              <w:t xml:space="preserve">Without Reranker</w:t>
+                <w:color w:val="FFFFFF"/>
+              </w:rPr>
+              <w:t xml:space="preserve">WithoutReranker</w:t>
             </w:r>
           </w:p>
         </w:tc>
         <w:tc>
           <w:tcPr>
-            <w:shd w:val="clear" w:color="auto" w:fill="1F3864"/>
+            <w:shd w:val="clear" w:color="auto" w:fill="2E75B6"/>
+            <w:gridSpan w:val="2"/>
           </w:tcPr>
           <w:p>
             <w:pPr>
@@ -10433,16 +10450,19 @@
             </w:pPr>
             <w:r>
               <w:rPr>
-                <w:sz w:val="16"/>
+                <w:sz w:val="18"/>
+                <w:szCs w:val="18"/>
                 <w:b/>
-              </w:rPr>
-              <w:t xml:space="preserve">Without Reranker</w:t>
+                <w:color w:val="FFFFFF"/>
+              </w:rPr>
+              <w:t xml:space="preserve">bge-reranker-base</w:t>
             </w:r>
           </w:p>
         </w:tc>
         <w:tc>
           <w:tcPr>
-            <w:shd w:val="clear" w:color="auto" w:fill="1F3864"/>
+            <w:shd w:val="clear" w:color="auto" w:fill="375623"/>
+            <w:gridSpan w:val="2"/>
           </w:tcPr>
           <w:p>
             <w:pPr>
@@ -10450,16 +10470,19 @@
             </w:pPr>
             <w:r>
               <w:rPr>
-                <w:sz w:val="16"/>
+                <w:sz w:val="18"/>
+                <w:szCs w:val="18"/>
                 <w:b/>
-              </w:rPr>
-              <w:t xml:space="preserve">bge-reranker-base</w:t>
+                <w:color w:val="FFFFFF"/>
+              </w:rPr>
+              <w:t xml:space="preserve">bge-reranker-large</w:t>
             </w:r>
           </w:p>
         </w:tc>
         <w:tc>
           <w:tcPr>
-            <w:shd w:val="clear" w:color="auto" w:fill="1F3864"/>
+            <w:shd w:val="clear" w:color="auto" w:fill="C55A11"/>
+            <w:gridSpan w:val="2"/>
           </w:tcPr>
           <w:p>
             <w:pPr>
@@ -10467,76 +10490,10 @@
             </w:pPr>
             <w:r>
               <w:rPr>
-                <w:sz w:val="16"/>
+                <w:sz w:val="18"/>
+                <w:szCs w:val="18"/>
                 <w:b/>
-              </w:rPr>
-              <w:t xml:space="preserve">bge-reranker-base</w:t>
-            </w:r>
-          </w:p>
-        </w:tc>
-        <w:tc>
-          <w:tcPr>
-            <w:shd w:val="clear" w:color="auto" w:fill="1F3864"/>
-          </w:tcPr>
-          <w:p>
-            <w:pPr>
-              <w:jc w:val="center"/>
-            </w:pPr>
-            <w:r>
-              <w:rPr>
-                <w:sz w:val="16"/>
-                <w:b/>
-              </w:rPr>
-              <w:t xml:space="preserve">bge-reranker-large</w:t>
-            </w:r>
-          </w:p>
-        </w:tc>
-        <w:tc>
-          <w:tcPr>
-            <w:shd w:val="clear" w:color="auto" w:fill="1F3864"/>
-          </w:tcPr>
-          <w:p>
-            <w:pPr>
-              <w:jc w:val="center"/>
-            </w:pPr>
-            <w:r>
-              <w:rPr>
-                <w:sz w:val="16"/>
-                <w:b/>
-              </w:rPr>
-              <w:t xml:space="preserve">bge-reranker-large</w:t>
-            </w:r>
-          </w:p>
-        </w:tc>
-        <w:tc>
-          <w:tcPr>
-            <w:shd w:val="clear" w:color="auto" w:fill="1F3864"/>
-          </w:tcPr>
-          <w:p>
-            <w:pPr>
-              <w:jc w:val="center"/>
-            </w:pPr>
-            <w:r>
-              <w:rPr>
-                <w:sz w:val="16"/>
-                <w:b/>
-              </w:rPr>
-              <w:t xml:space="preserve">Cohere-Reranker</w:t>
-            </w:r>
-          </w:p>
-        </w:tc>
-        <w:tc>
-          <w:tcPr>
-            <w:shd w:val="clear" w:color="auto" w:fill="1F3864"/>
-          </w:tcPr>
-          <w:p>
-            <w:pPr>
-              <w:jc w:val="center"/>
-            </w:pPr>
-            <w:r>
-              <w:rPr>
-                <w:sz w:val="16"/>
-                <w:b/>
+                <w:color w:val="FFFFFF"/>
               </w:rPr>
               <w:t xml:space="preserve">Cohere-Reranker</w:t>
             </w:r>
@@ -10546,7 +10503,7 @@
       <w:tr>
         <w:tc>
           <w:tcPr>
-            <w:shd w:val="clear" w:color="auto" w:fill="2E4057"/>
+            <w:shd w:val="clear" w:color="auto" w:fill="1F3864"/>
           </w:tcPr>
           <w:p>
             <w:pPr>
@@ -10555,9 +10512,11 @@
             <w:r>
               <w:rPr>
                 <w:sz w:val="16"/>
+                <w:szCs w:val="16"/>
                 <w:b/>
-              </w:rPr>
-              <w:t xml:space="preserve">Model</w:t>
+                <w:color w:val="FFFFFF"/>
+              </w:rPr>
+              <w:t xml:space="preserve">Embedding</w:t>
             </w:r>
           </w:p>
         </w:tc>
@@ -10572,7 +10531,9 @@
             <w:r>
               <w:rPr>
                 <w:sz w:val="16"/>
+                <w:szCs w:val="16"/>
                 <w:b/>
+                <w:color w:val="FFFFFF"/>
               </w:rPr>
               <w:t xml:space="preserve">Hit Rate</w:t>
             </w:r>
@@ -10589,7 +10550,9 @@
             <w:r>
               <w:rPr>
                 <w:sz w:val="16"/>
+                <w:szCs w:val="16"/>
                 <w:b/>
+                <w:color w:val="FFFFFF"/>
               </w:rPr>
               <w:t xml:space="preserve">MRR</w:t>
             </w:r>
@@ -10597,7 +10560,7 @@
         </w:tc>
         <w:tc>
           <w:tcPr>
-            <w:shd w:val="clear" w:color="auto" w:fill="2E4057"/>
+            <w:shd w:val="clear" w:color="auto" w:fill="2E75B6"/>
           </w:tcPr>
           <w:p>
             <w:pPr>
@@ -10606,7 +10569,9 @@
             <w:r>
               <w:rPr>
                 <w:sz w:val="16"/>
+                <w:szCs w:val="16"/>
                 <w:b/>
+                <w:color w:val="FFFFFF"/>
               </w:rPr>
               <w:t xml:space="preserve">Hit Rate</w:t>
             </w:r>
@@ -10614,7 +10579,7 @@
         </w:tc>
         <w:tc>
           <w:tcPr>
-            <w:shd w:val="clear" w:color="auto" w:fill="2E4057"/>
+            <w:shd w:val="clear" w:color="auto" w:fill="2E75B6"/>
           </w:tcPr>
           <w:p>
             <w:pPr>
@@ -10623,7 +10588,9 @@
             <w:r>
               <w:rPr>
                 <w:sz w:val="16"/>
+                <w:szCs w:val="16"/>
                 <w:b/>
+                <w:color w:val="FFFFFF"/>
               </w:rPr>
               <w:t xml:space="preserve">MRR</w:t>
             </w:r>
@@ -10631,7 +10598,7 @@
         </w:tc>
         <w:tc>
           <w:tcPr>
-            <w:shd w:val="clear" w:color="auto" w:fill="2E4057"/>
+            <w:shd w:val="clear" w:color="auto" w:fill="375623"/>
           </w:tcPr>
           <w:p>
             <w:pPr>
@@ -10640,7 +10607,9 @@
             <w:r>
               <w:rPr>
                 <w:sz w:val="16"/>
+                <w:szCs w:val="16"/>
                 <w:b/>
+                <w:color w:val="FFFFFF"/>
               </w:rPr>
               <w:t xml:space="preserve">Hit Rate</w:t>
             </w:r>
@@ -10648,7 +10617,7 @@
         </w:tc>
         <w:tc>
           <w:tcPr>
-            <w:shd w:val="clear" w:color="auto" w:fill="2E4057"/>
+            <w:shd w:val="clear" w:color="auto" w:fill="375623"/>
           </w:tcPr>
           <w:p>
             <w:pPr>
@@ -10657,7 +10626,9 @@
             <w:r>
               <w:rPr>
                 <w:sz w:val="16"/>
+                <w:szCs w:val="16"/>
                 <w:b/>
+                <w:color w:val="FFFFFF"/>
               </w:rPr>
               <w:t xml:space="preserve">MRR</w:t>
             </w:r>
@@ -10665,7 +10636,7 @@
         </w:tc>
         <w:tc>
           <w:tcPr>
-            <w:shd w:val="clear" w:color="auto" w:fill="2E4057"/>
+            <w:shd w:val="clear" w:color="auto" w:fill="C55A11"/>
           </w:tcPr>
           <w:p>
             <w:pPr>
@@ -10674,7 +10645,9 @@
             <w:r>
               <w:rPr>
                 <w:sz w:val="16"/>
+                <w:szCs w:val="16"/>
                 <w:b/>
+                <w:color w:val="FFFFFF"/>
               </w:rPr>
               <w:t xml:space="preserve">Hit Rate</w:t>
             </w:r>
@@ -10682,7 +10655,7 @@
         </w:tc>
         <w:tc>
           <w:tcPr>
-            <w:shd w:val="clear" w:color="auto" w:fill="2E4057"/>
+            <w:shd w:val="clear" w:color="auto" w:fill="C55A11"/>
           </w:tcPr>
           <w:p>
             <w:pPr>
@@ -10691,7 +10664,9 @@
             <w:r>
               <w:rPr>
                 <w:sz w:val="16"/>
+                <w:szCs w:val="16"/>
                 <w:b/>
+                <w:color w:val="FFFFFF"/>
               </w:rPr>
               <w:t xml:space="preserve">MRR</w:t>
             </w:r>
@@ -10700,7 +10675,9 @@
       </w:tr>
       <w:tr>
         <w:tc>
-          <w:tcPr/>
+          <w:tcPr>
+            <w:shd w:val="clear" w:color="auto" w:fill="F2F2F2"/>
+          </w:tcPr>
           <w:p>
             <w:pPr>
               <w:jc w:val="center"/>
@@ -10708,6 +10685,9 @@
             <w:r>
               <w:rPr>
                 <w:sz w:val="16"/>
+                <w:szCs w:val="16"/>
+                <w:b/>
+                <w:color w:val="000000"/>
               </w:rPr>
               <w:t xml:space="preserve">OpenAI</w:t>
             </w:r>
@@ -10722,8 +10702,10 @@
             <w:r>
               <w:rPr>
                 <w:sz w:val="16"/>
-              </w:rPr>
-              <w:t xml:space="preserve">0.8764</w:t>
+                <w:szCs w:val="16"/>
+                <w:color w:val="000000"/>
+              </w:rPr>
+              <w:t xml:space="preserve">0.876404</w:t>
             </w:r>
           </w:p>
         </w:tc>
@@ -10736,8 +10718,10 @@
             <w:r>
               <w:rPr>
                 <w:sz w:val="16"/>
-              </w:rPr>
-              <w:t xml:space="preserve">0.7182</w:t>
+                <w:szCs w:val="16"/>
+                <w:color w:val="000000"/>
+              </w:rPr>
+              <w:t xml:space="preserve">0.718165</w:t>
             </w:r>
           </w:p>
         </w:tc>
@@ -10750,8 +10734,10 @@
             <w:r>
               <w:rPr>
                 <w:sz w:val="16"/>
-              </w:rPr>
-              <w:t xml:space="preserve">0.9157</w:t>
+                <w:szCs w:val="16"/>
+                <w:color w:val="000000"/>
+              </w:rPr>
+              <w:t xml:space="preserve">0.91573</w:t>
             </w:r>
           </w:p>
         </w:tc>
@@ -10764,8 +10750,48 @@
             <w:r>
               <w:rPr>
                 <w:sz w:val="16"/>
-              </w:rPr>
-              <w:t xml:space="preserve">0.8326</w:t>
+                <w:szCs w:val="16"/>
+                <w:color w:val="000000"/>
+              </w:rPr>
+              <w:t xml:space="preserve">0.832584</w:t>
+            </w:r>
+          </w:p>
+        </w:tc>
+        <w:tc>
+          <w:tcPr>
+            <w:shd w:val="clear" w:color="auto" w:fill="F4B942"/>
+          </w:tcPr>
+          <w:p>
+            <w:pPr>
+              <w:jc w:val="center"/>
+            </w:pPr>
+            <w:r>
+              <w:rPr>
+                <w:sz w:val="16"/>
+                <w:szCs w:val="16"/>
+                <w:b/>
+                <w:color w:val="FFFFFF"/>
+              </w:rPr>
+              <w:t xml:space="preserve">0.910112</w:t>
+            </w:r>
+          </w:p>
+        </w:tc>
+        <w:tc>
+          <w:tcPr>
+            <w:shd w:val="clear" w:color="auto" w:fill="F4B942"/>
+          </w:tcPr>
+          <w:p>
+            <w:pPr>
+              <w:jc w:val="center"/>
+            </w:pPr>
+            <w:r>
+              <w:rPr>
+                <w:sz w:val="16"/>
+                <w:szCs w:val="16"/>
+                <w:b/>
+                <w:color w:val="FFFFFF"/>
+              </w:rPr>
+              <w:t xml:space="preserve">0.855805</w:t>
             </w:r>
           </w:p>
         </w:tc>
@@ -10778,8 +10804,10 @@
             <w:r>
               <w:rPr>
                 <w:sz w:val="16"/>
-              </w:rPr>
-              <w:t xml:space="preserve">0.9101</w:t>
+                <w:szCs w:val="16"/>
+                <w:color w:val="000000"/>
+              </w:rPr>
+              <w:t xml:space="preserve">0.926966</w:t>
             </w:r>
           </w:p>
         </w:tc>
@@ -10792,43 +10820,19 @@
             <w:r>
               <w:rPr>
                 <w:sz w:val="16"/>
-              </w:rPr>
-              <w:t xml:space="preserve">0.8558</w:t>
-            </w:r>
-          </w:p>
-        </w:tc>
-        <w:tc>
-          <w:tcPr/>
-          <w:p>
-            <w:pPr>
-              <w:jc w:val="center"/>
-            </w:pPr>
-            <w:r>
-              <w:rPr>
-                <w:sz w:val="16"/>
-              </w:rPr>
-              <w:t xml:space="preserve">0.9270</w:t>
-            </w:r>
-          </w:p>
-        </w:tc>
-        <w:tc>
-          <w:tcPr/>
-          <w:p>
-            <w:pPr>
-              <w:jc w:val="center"/>
-            </w:pPr>
-            <w:r>
-              <w:rPr>
-                <w:sz w:val="16"/>
-              </w:rPr>
-              <w:t xml:space="preserve">0.8657</w:t>
+                <w:szCs w:val="16"/>
+                <w:color w:val="000000"/>
+              </w:rPr>
+              <w:t xml:space="preserve">0.86573</w:t>
             </w:r>
           </w:p>
         </w:tc>
       </w:tr>
       <w:tr>
         <w:tc>
-          <w:tcPr/>
+          <w:tcPr>
+            <w:shd w:val="clear" w:color="auto" w:fill="F2F2F2"/>
+          </w:tcPr>
           <w:p>
             <w:pPr>
               <w:jc w:val="center"/>
@@ -10836,6 +10840,9 @@
             <w:r>
               <w:rPr>
                 <w:sz w:val="16"/>
+                <w:szCs w:val="16"/>
+                <w:b/>
+                <w:color w:val="000000"/>
               </w:rPr>
               <w:t xml:space="preserve">bge-large</w:t>
             </w:r>
@@ -10850,8 +10857,10 @@
             <w:r>
               <w:rPr>
                 <w:sz w:val="16"/>
-              </w:rPr>
-              <w:t xml:space="preserve">0.7528</w:t>
+                <w:szCs w:val="16"/>
+                <w:color w:val="000000"/>
+              </w:rPr>
+              <w:t xml:space="preserve">0.752809</w:t>
             </w:r>
           </w:p>
         </w:tc>
@@ -10864,8 +10873,10 @@
             <w:r>
               <w:rPr>
                 <w:sz w:val="16"/>
-              </w:rPr>
-              <w:t xml:space="preserve">0.5972</w:t>
+                <w:szCs w:val="16"/>
+                <w:color w:val="000000"/>
+              </w:rPr>
+              <w:t xml:space="preserve">0.597191</w:t>
             </w:r>
           </w:p>
         </w:tc>
@@ -10878,8 +10889,10 @@
             <w:r>
               <w:rPr>
                 <w:sz w:val="16"/>
-              </w:rPr>
-              <w:t xml:space="preserve">0.8596</w:t>
+                <w:szCs w:val="16"/>
+                <w:color w:val="000000"/>
+              </w:rPr>
+              <w:t xml:space="preserve">0.859551</w:t>
             </w:r>
           </w:p>
         </w:tc>
@@ -10892,8 +10905,10 @@
             <w:r>
               <w:rPr>
                 <w:sz w:val="16"/>
-              </w:rPr>
-              <w:t xml:space="preserve">0.8052</w:t>
+                <w:szCs w:val="16"/>
+                <w:color w:val="000000"/>
+              </w:rPr>
+              <w:t xml:space="preserve">0.805243</w:t>
             </w:r>
           </w:p>
         </w:tc>
@@ -10906,8 +10921,10 @@
             <w:r>
               <w:rPr>
                 <w:sz w:val="16"/>
-              </w:rPr>
-              <w:t xml:space="preserve">0.8652</w:t>
+                <w:szCs w:val="16"/>
+                <w:color w:val="000000"/>
+              </w:rPr>
+              <w:t xml:space="preserve">0.865169</w:t>
             </w:r>
           </w:p>
         </w:tc>
@@ -10920,8 +10937,10 @@
             <w:r>
               <w:rPr>
                 <w:sz w:val="16"/>
-              </w:rPr>
-              <w:t xml:space="preserve">0.8160</w:t>
+                <w:szCs w:val="16"/>
+                <w:color w:val="000000"/>
+              </w:rPr>
+              <w:t xml:space="preserve">0.816011</w:t>
             </w:r>
           </w:p>
         </w:tc>
@@ -10934,8 +10953,10 @@
             <w:r>
               <w:rPr>
                 <w:sz w:val="16"/>
-              </w:rPr>
-              <w:t xml:space="preserve">0.8764</w:t>
+                <w:szCs w:val="16"/>
+                <w:color w:val="000000"/>
+              </w:rPr>
+              <w:t xml:space="preserve">0.876404</w:t>
             </w:r>
           </w:p>
         </w:tc>
@@ -10948,15 +10969,19 @@
             <w:r>
               <w:rPr>
                 <w:sz w:val="16"/>
-              </w:rPr>
-              <w:t xml:space="preserve">0.8228</w:t>
+                <w:szCs w:val="16"/>
+                <w:color w:val="000000"/>
+              </w:rPr>
+              <w:t xml:space="preserve">0.822753</w:t>
             </w:r>
           </w:p>
         </w:tc>
       </w:tr>
       <w:tr>
         <w:tc>
-          <w:tcPr/>
+          <w:tcPr>
+            <w:shd w:val="clear" w:color="auto" w:fill="F2F2F2"/>
+          </w:tcPr>
           <w:p>
             <w:pPr>
               <w:jc w:val="center"/>
@@ -10964,6 +10989,9 @@
             <w:r>
               <w:rPr>
                 <w:sz w:val="16"/>
+                <w:szCs w:val="16"/>
+                <w:b/>
+                <w:color w:val="000000"/>
               </w:rPr>
               <w:t xml:space="preserve">llm-embedder</w:t>
             </w:r>
@@ -10978,8 +11006,10 @@
             <w:r>
               <w:rPr>
                 <w:sz w:val="16"/>
-              </w:rPr>
-              <w:t xml:space="preserve">0.8146</w:t>
+                <w:szCs w:val="16"/>
+                <w:color w:val="000000"/>
+              </w:rPr>
+              <w:t xml:space="preserve">0.814607</w:t>
             </w:r>
           </w:p>
         </w:tc>
@@ -10992,8 +11022,10 @@
             <w:r>
               <w:rPr>
                 <w:sz w:val="16"/>
-              </w:rPr>
-              <w:t xml:space="preserve">0.5873</w:t>
+                <w:szCs w:val="16"/>
+                <w:color w:val="000000"/>
+              </w:rPr>
+              <w:t xml:space="preserve">0.587266</w:t>
             </w:r>
           </w:p>
         </w:tc>
@@ -11006,8 +11038,10 @@
             <w:r>
               <w:rPr>
                 <w:sz w:val="16"/>
-              </w:rPr>
-              <w:t xml:space="preserve">0.8708</w:t>
+                <w:szCs w:val="16"/>
+                <w:color w:val="000000"/>
+              </w:rPr>
+              <w:t xml:space="preserve">0.870787</w:t>
             </w:r>
           </w:p>
         </w:tc>
@@ -11020,8 +11054,10 @@
             <w:r>
               <w:rPr>
                 <w:sz w:val="16"/>
-              </w:rPr>
-              <w:t xml:space="preserve">0.8031</w:t>
+                <w:szCs w:val="16"/>
+                <w:color w:val="000000"/>
+              </w:rPr>
+              <w:t xml:space="preserve">0.80309</w:t>
             </w:r>
           </w:p>
         </w:tc>
@@ -11034,8 +11070,10 @@
             <w:r>
               <w:rPr>
                 <w:sz w:val="16"/>
-              </w:rPr>
-              <w:t xml:space="preserve">0.8764</w:t>
+                <w:szCs w:val="16"/>
+                <w:color w:val="000000"/>
+              </w:rPr>
+              <w:t xml:space="preserve">0.876404</w:t>
             </w:r>
           </w:p>
         </w:tc>
@@ -11048,8 +11086,10 @@
             <w:r>
               <w:rPr>
                 <w:sz w:val="16"/>
-              </w:rPr>
-              <w:t xml:space="preserve">0.8246</w:t>
+                <w:szCs w:val="16"/>
+                <w:color w:val="000000"/>
+              </w:rPr>
+              <w:t xml:space="preserve">0.824625</w:t>
             </w:r>
           </w:p>
         </w:tc>
@@ -11062,8 +11102,10 @@
             <w:r>
               <w:rPr>
                 <w:sz w:val="16"/>
-              </w:rPr>
-              <w:t xml:space="preserve">0.8820</w:t>
+                <w:szCs w:val="16"/>
+                <w:color w:val="000000"/>
+              </w:rPr>
+              <w:t xml:space="preserve">0.882022</w:t>
             </w:r>
           </w:p>
         </w:tc>
@@ -11076,15 +11118,19 @@
             <w:r>
               <w:rPr>
                 <w:sz w:val="16"/>
-              </w:rPr>
-              <w:t xml:space="preserve">0.8302</w:t>
+                <w:szCs w:val="16"/>
+                <w:color w:val="000000"/>
+              </w:rPr>
+              <w:t xml:space="preserve">0.830243</w:t>
             </w:r>
           </w:p>
         </w:tc>
       </w:tr>
       <w:tr>
         <w:tc>
-          <w:tcPr/>
+          <w:tcPr>
+            <w:shd w:val="clear" w:color="auto" w:fill="F2F2F2"/>
+          </w:tcPr>
           <w:p>
             <w:pPr>
               <w:jc w:val="center"/>
@@ -11092,6 +11138,9 @@
             <w:r>
               <w:rPr>
                 <w:sz w:val="16"/>
+                <w:szCs w:val="16"/>
+                <w:b/>
+                <w:color w:val="000000"/>
               </w:rPr>
               <w:t xml:space="preserve">Cohere-v2</w:t>
             </w:r>
@@ -11106,8 +11155,10 @@
             <w:r>
               <w:rPr>
                 <w:sz w:val="16"/>
-              </w:rPr>
-              <w:t xml:space="preserve">0.7809</w:t>
+                <w:szCs w:val="16"/>
+                <w:color w:val="000000"/>
+              </w:rPr>
+              <w:t xml:space="preserve">0.780899</w:t>
             </w:r>
           </w:p>
         </w:tc>
@@ -11120,8 +11171,10 @@
             <w:r>
               <w:rPr>
                 <w:sz w:val="16"/>
-              </w:rPr>
-              <w:t xml:space="preserve">0.5705</w:t>
+                <w:szCs w:val="16"/>
+                <w:color w:val="000000"/>
+              </w:rPr>
+              <w:t xml:space="preserve">0.570506</w:t>
             </w:r>
           </w:p>
         </w:tc>
@@ -11134,8 +11187,10 @@
             <w:r>
               <w:rPr>
                 <w:sz w:val="16"/>
-              </w:rPr>
-              <w:t xml:space="preserve">0.8764</w:t>
+                <w:szCs w:val="16"/>
+                <w:color w:val="000000"/>
+              </w:rPr>
+              <w:t xml:space="preserve">0.876404</w:t>
             </w:r>
           </w:p>
         </w:tc>
@@ -11148,8 +11203,10 @@
             <w:r>
               <w:rPr>
                 <w:sz w:val="16"/>
-              </w:rPr>
-              <w:t xml:space="preserve">0.7981</w:t>
+                <w:szCs w:val="16"/>
+                <w:color w:val="000000"/>
+              </w:rPr>
+              <w:t xml:space="preserve">0.798127</w:t>
             </w:r>
           </w:p>
         </w:tc>
@@ -11162,8 +11219,10 @@
             <w:r>
               <w:rPr>
                 <w:sz w:val="16"/>
-              </w:rPr>
-              <w:t xml:space="preserve">0.8764</w:t>
+                <w:szCs w:val="16"/>
+                <w:color w:val="000000"/>
+              </w:rPr>
+              <w:t xml:space="preserve">0.876404</w:t>
             </w:r>
           </w:p>
         </w:tc>
@@ -11176,8 +11235,10 @@
             <w:r>
               <w:rPr>
                 <w:sz w:val="16"/>
-              </w:rPr>
-              <w:t xml:space="preserve">0.8253</w:t>
+                <w:szCs w:val="16"/>
+                <w:color w:val="000000"/>
+              </w:rPr>
+              <w:t xml:space="preserve">0.825281</w:t>
             </w:r>
           </w:p>
         </w:tc>
@@ -11190,8 +11251,10 @@
             <w:r>
               <w:rPr>
                 <w:sz w:val="16"/>
-              </w:rPr>
-              <w:t xml:space="preserve">0.8764</w:t>
+                <w:szCs w:val="16"/>
+                <w:color w:val="000000"/>
+              </w:rPr>
+              <w:t xml:space="preserve">0.876404</w:t>
             </w:r>
           </w:p>
         </w:tc>
@@ -11204,15 +11267,19 @@
             <w:r>
               <w:rPr>
                 <w:sz w:val="16"/>
-              </w:rPr>
-              <w:t xml:space="preserve">0.8155</w:t>
+                <w:szCs w:val="16"/>
+                <w:color w:val="000000"/>
+              </w:rPr>
+              <w:t xml:space="preserve">0.815543</w:t>
             </w:r>
           </w:p>
         </w:tc>
       </w:tr>
       <w:tr>
         <w:tc>
-          <w:tcPr/>
+          <w:tcPr>
+            <w:shd w:val="clear" w:color="auto" w:fill="F2F2F2"/>
+          </w:tcPr>
           <w:p>
             <w:pPr>
               <w:jc w:val="center"/>
@@ -11220,6 +11287,9 @@
             <w:r>
               <w:rPr>
                 <w:sz w:val="16"/>
+                <w:szCs w:val="16"/>
+                <w:b/>
+                <w:color w:val="000000"/>
               </w:rPr>
               <w:t xml:space="preserve">Cohere-v3</w:t>
             </w:r>
@@ -11234,8 +11304,10 @@
             <w:r>
               <w:rPr>
                 <w:sz w:val="16"/>
-              </w:rPr>
-              <w:t xml:space="preserve">0.8258</w:t>
+                <w:szCs w:val="16"/>
+                <w:color w:val="000000"/>
+              </w:rPr>
+              <w:t xml:space="preserve">0.825843</w:t>
             </w:r>
           </w:p>
         </w:tc>
@@ -11248,8 +11320,10 @@
             <w:r>
               <w:rPr>
                 <w:sz w:val="16"/>
-              </w:rPr>
-              <w:t xml:space="preserve">0.6245</w:t>
+                <w:szCs w:val="16"/>
+                <w:color w:val="000000"/>
+              </w:rPr>
+              <w:t xml:space="preserve">0.624532</w:t>
             </w:r>
           </w:p>
         </w:tc>
@@ -11262,8 +11336,10 @@
             <w:r>
               <w:rPr>
                 <w:sz w:val="16"/>
-              </w:rPr>
-              <w:t xml:space="preserve">0.8820</w:t>
+                <w:szCs w:val="16"/>
+                <w:color w:val="000000"/>
+              </w:rPr>
+              <w:t xml:space="preserve">0.882022</w:t>
             </w:r>
           </w:p>
         </w:tc>
@@ -11276,8 +11352,10 @@
             <w:r>
               <w:rPr>
                 <w:sz w:val="16"/>
-              </w:rPr>
-              <w:t xml:space="preserve">0.8061</w:t>
+                <w:szCs w:val="16"/>
+                <w:color w:val="000000"/>
+              </w:rPr>
+              <w:t xml:space="preserve">0.806086</w:t>
             </w:r>
           </w:p>
         </w:tc>
@@ -11290,8 +11368,10 @@
             <w:r>
               <w:rPr>
                 <w:sz w:val="16"/>
-              </w:rPr>
-              <w:t xml:space="preserve">0.8820</w:t>
+                <w:szCs w:val="16"/>
+                <w:color w:val="000000"/>
+              </w:rPr>
+              <w:t xml:space="preserve">0.882022</w:t>
             </w:r>
           </w:p>
         </w:tc>
@@ -11304,8 +11384,10 @@
             <w:r>
               <w:rPr>
                 <w:sz w:val="16"/>
-              </w:rPr>
-              <w:t xml:space="preserve">0.8346</w:t>
+                <w:szCs w:val="16"/>
+                <w:color w:val="000000"/>
+              </w:rPr>
+              <w:t xml:space="preserve">0.834644</w:t>
             </w:r>
           </w:p>
         </w:tc>
@@ -11318,8 +11400,10 @@
             <w:r>
               <w:rPr>
                 <w:sz w:val="16"/>
-              </w:rPr>
-              <w:t xml:space="preserve">0.8876</w:t>
+                <w:szCs w:val="16"/>
+                <w:color w:val="000000"/>
+              </w:rPr>
+              <w:t xml:space="preserve">0.88764</w:t>
             </w:r>
           </w:p>
         </w:tc>
@@ -11332,15 +11416,19 @@
             <w:r>
               <w:rPr>
                 <w:sz w:val="16"/>
-              </w:rPr>
-              <w:t xml:space="preserve">0.8360</w:t>
+                <w:szCs w:val="16"/>
+                <w:color w:val="000000"/>
+              </w:rPr>
+              <w:t xml:space="preserve">0.836049</w:t>
             </w:r>
           </w:p>
         </w:tc>
       </w:tr>
       <w:tr>
         <w:tc>
-          <w:tcPr/>
+          <w:tcPr>
+            <w:shd w:val="clear" w:color="auto" w:fill="F2F2F2"/>
+          </w:tcPr>
           <w:p>
             <w:pPr>
               <w:jc w:val="center"/>
@@ -11348,6 +11436,9 @@
             <w:r>
               <w:rPr>
                 <w:sz w:val="16"/>
+                <w:szCs w:val="16"/>
+                <w:b/>
+                <w:color w:val="000000"/>
               </w:rPr>
               <w:t xml:space="preserve">Voyage</w:t>
             </w:r>
@@ -11362,8 +11453,10 @@
             <w:r>
               <w:rPr>
                 <w:sz w:val="16"/>
-              </w:rPr>
-              <w:t xml:space="preserve">0.8315</w:t>
+                <w:szCs w:val="16"/>
+                <w:color w:val="000000"/>
+              </w:rPr>
+              <w:t xml:space="preserve">0.831461</w:t>
             </w:r>
           </w:p>
         </w:tc>
@@ -11376,8 +11469,10 @@
             <w:r>
               <w:rPr>
                 <w:sz w:val="16"/>
-              </w:rPr>
-              <w:t xml:space="preserve">0.6874</w:t>
+                <w:szCs w:val="16"/>
+                <w:color w:val="000000"/>
+              </w:rPr>
+              <w:t xml:space="preserve">0.68736</w:t>
             </w:r>
           </w:p>
         </w:tc>
@@ -11390,8 +11485,10 @@
             <w:r>
               <w:rPr>
                 <w:sz w:val="16"/>
-              </w:rPr>
-              <w:t xml:space="preserve">0.9270</w:t>
+                <w:szCs w:val="16"/>
+                <w:color w:val="000000"/>
+              </w:rPr>
+              <w:t xml:space="preserve">0.926966</w:t>
             </w:r>
           </w:p>
         </w:tc>
@@ -11404,8 +11501,48 @@
             <w:r>
               <w:rPr>
                 <w:sz w:val="16"/>
-              </w:rPr>
-              <w:t xml:space="preserve">0.8372</w:t>
+                <w:szCs w:val="16"/>
+                <w:color w:val="000000"/>
+              </w:rPr>
+              <w:t xml:space="preserve">0.837172</w:t>
+            </w:r>
+          </w:p>
+        </w:tc>
+        <w:tc>
+          <w:tcPr>
+            <w:shd w:val="clear" w:color="auto" w:fill="FF0000"/>
+          </w:tcPr>
+          <w:p>
+            <w:pPr>
+              <w:jc w:val="center"/>
+            </w:pPr>
+            <w:r>
+              <w:rPr>
+                <w:sz w:val="16"/>
+                <w:szCs w:val="16"/>
+                <w:b/>
+                <w:color w:val="FFFFFF"/>
+              </w:rPr>
+              <w:t xml:space="preserve">0.91573</w:t>
+            </w:r>
+          </w:p>
+        </w:tc>
+        <w:tc>
+          <w:tcPr>
+            <w:shd w:val="clear" w:color="auto" w:fill="FF0000"/>
+          </w:tcPr>
+          <w:p>
+            <w:pPr>
+              <w:jc w:val="center"/>
+            </w:pPr>
+            <w:r>
+              <w:rPr>
+                <w:sz w:val="16"/>
+                <w:szCs w:val="16"/>
+                <w:b/>
+                <w:color w:val="FFFFFF"/>
+              </w:rPr>
+              <w:t xml:space="preserve">0.858614</w:t>
             </w:r>
           </w:p>
         </w:tc>
@@ -11418,8 +11555,10 @@
             <w:r>
               <w:rPr>
                 <w:sz w:val="16"/>
-              </w:rPr>
-              <w:t xml:space="preserve">0.9157</w:t>
+                <w:szCs w:val="16"/>
+                <w:color w:val="000000"/>
+              </w:rPr>
+              <w:t xml:space="preserve">0.91573</w:t>
             </w:r>
           </w:p>
         </w:tc>
@@ -11432,43 +11571,19 @@
             <w:r>
               <w:rPr>
                 <w:sz w:val="16"/>
-              </w:rPr>
-              <w:t xml:space="preserve">0.8586</w:t>
-            </w:r>
-          </w:p>
-        </w:tc>
-        <w:tc>
-          <w:tcPr/>
-          <w:p>
-            <w:pPr>
-              <w:jc w:val="center"/>
-            </w:pPr>
-            <w:r>
-              <w:rPr>
-                <w:sz w:val="16"/>
-              </w:rPr>
-              <w:t xml:space="preserve">0.9157</w:t>
-            </w:r>
-          </w:p>
-        </w:tc>
-        <w:tc>
-          <w:tcPr/>
-          <w:p>
-            <w:pPr>
-              <w:jc w:val="center"/>
-            </w:pPr>
-            <w:r>
-              <w:rPr>
-                <w:sz w:val="16"/>
-              </w:rPr>
-              <w:t xml:space="preserve">0.8512</w:t>
+                <w:szCs w:val="16"/>
+                <w:color w:val="000000"/>
+              </w:rPr>
+              <w:t xml:space="preserve">0.851217</w:t>
             </w:r>
           </w:p>
         </w:tc>
       </w:tr>
       <w:tr>
         <w:tc>
-          <w:tcPr/>
+          <w:tcPr>
+            <w:shd w:val="clear" w:color="auto" w:fill="F2F2F2"/>
+          </w:tcPr>
           <w:p>
             <w:pPr>
               <w:jc w:val="center"/>
@@ -11476,6 +11591,9 @@
             <w:r>
               <w:rPr>
                 <w:sz w:val="16"/>
+                <w:szCs w:val="16"/>
+                <w:b/>
+                <w:color w:val="000000"/>
               </w:rPr>
               <w:t xml:space="preserve">JinaAI-Small</w:t>
             </w:r>
@@ -11490,8 +11608,10 @@
             <w:r>
               <w:rPr>
                 <w:sz w:val="16"/>
-              </w:rPr>
-              <w:t xml:space="preserve">0.8315</w:t>
+                <w:szCs w:val="16"/>
+                <w:color w:val="000000"/>
+              </w:rPr>
+              <w:t xml:space="preserve">0.831461</w:t>
             </w:r>
           </w:p>
         </w:tc>
@@ -11504,8 +11624,10 @@
             <w:r>
               <w:rPr>
                 <w:sz w:val="16"/>
-              </w:rPr>
-              <w:t xml:space="preserve">0.6140</w:t>
+                <w:szCs w:val="16"/>
+                <w:color w:val="000000"/>
+              </w:rPr>
+              <w:t xml:space="preserve">0.614045</w:t>
             </w:r>
           </w:p>
         </w:tc>
@@ -11518,8 +11640,10 @@
             <w:r>
               <w:rPr>
                 <w:sz w:val="16"/>
-              </w:rPr>
-              <w:t xml:space="preserve">0.9157</w:t>
+                <w:szCs w:val="16"/>
+                <w:color w:val="000000"/>
+              </w:rPr>
+              <w:t xml:space="preserve">0.91573</w:t>
             </w:r>
           </w:p>
         </w:tc>
@@ -11532,8 +11656,48 @@
             <w:r>
               <w:rPr>
                 <w:sz w:val="16"/>
-              </w:rPr>
-              <w:t xml:space="preserve">0.8431</w:t>
+                <w:szCs w:val="16"/>
+                <w:color w:val="000000"/>
+              </w:rPr>
+              <w:t xml:space="preserve">0.843071</w:t>
+            </w:r>
+          </w:p>
+        </w:tc>
+        <w:tc>
+          <w:tcPr>
+            <w:shd w:val="clear" w:color="auto" w:fill="70AD47"/>
+          </w:tcPr>
+          <w:p>
+            <w:pPr>
+              <w:jc w:val="center"/>
+            </w:pPr>
+            <w:r>
+              <w:rPr>
+                <w:sz w:val="16"/>
+                <w:szCs w:val="16"/>
+                <w:b/>
+                <w:color w:val="FFFFFF"/>
+              </w:rPr>
+              <w:t xml:space="preserve">0.926966</w:t>
+            </w:r>
+          </w:p>
+        </w:tc>
+        <w:tc>
+          <w:tcPr>
+            <w:shd w:val="clear" w:color="auto" w:fill="70AD47"/>
+          </w:tcPr>
+          <w:p>
+            <w:pPr>
+              <w:jc w:val="center"/>
+            </w:pPr>
+            <w:r>
+              <w:rPr>
+                <w:sz w:val="16"/>
+                <w:szCs w:val="16"/>
+                <w:b/>
+                <w:color w:val="FFFFFF"/>
+              </w:rPr>
+              <w:t xml:space="preserve">0.857303</w:t>
             </w:r>
           </w:p>
         </w:tc>
@@ -11546,8 +11710,10 @@
             <w:r>
               <w:rPr>
                 <w:sz w:val="16"/>
-              </w:rPr>
-              <w:t xml:space="preserve">0.9270</w:t>
+                <w:szCs w:val="16"/>
+                <w:color w:val="000000"/>
+              </w:rPr>
+              <w:t xml:space="preserve">0.926966</w:t>
             </w:r>
           </w:p>
         </w:tc>
@@ -11560,43 +11726,19 @@
             <w:r>
               <w:rPr>
                 <w:sz w:val="16"/>
-              </w:rPr>
-              <w:t xml:space="preserve">0.8573</w:t>
-            </w:r>
-          </w:p>
-        </w:tc>
-        <w:tc>
-          <w:tcPr/>
-          <w:p>
-            <w:pPr>
-              <w:jc w:val="center"/>
-            </w:pPr>
-            <w:r>
-              <w:rPr>
-                <w:sz w:val="16"/>
-              </w:rPr>
-              <w:t xml:space="preserve">0.9270</w:t>
-            </w:r>
-          </w:p>
-        </w:tc>
-        <w:tc>
-          <w:tcPr/>
-          <w:p>
-            <w:pPr>
-              <w:jc w:val="center"/>
-            </w:pPr>
-            <w:r>
-              <w:rPr>
-                <w:sz w:val="16"/>
-              </w:rPr>
-              <w:t xml:space="preserve">0.8686</w:t>
+                <w:szCs w:val="16"/>
+                <w:color w:val="000000"/>
+              </w:rPr>
+              <w:t xml:space="preserve">0.868633</w:t>
             </w:r>
           </w:p>
         </w:tc>
       </w:tr>
       <w:tr>
         <w:tc>
-          <w:tcPr/>
+          <w:tcPr>
+            <w:shd w:val="clear" w:color="auto" w:fill="F2F2F2"/>
+          </w:tcPr>
           <w:p>
             <w:pPr>
               <w:jc w:val="center"/>
@@ -11604,6 +11746,9 @@
             <w:r>
               <w:rPr>
                 <w:sz w:val="16"/>
+                <w:szCs w:val="16"/>
+                <w:b/>
+                <w:color w:val="000000"/>
               </w:rPr>
               <w:t xml:space="preserve">JinaAI-Base</w:t>
             </w:r>
@@ -11618,8 +11763,10 @@
             <w:r>
               <w:rPr>
                 <w:sz w:val="16"/>
-              </w:rPr>
-              <w:t xml:space="preserve">0.8483</w:t>
+                <w:szCs w:val="16"/>
+                <w:color w:val="000000"/>
+              </w:rPr>
+              <w:t xml:space="preserve">0.848315</w:t>
             </w:r>
           </w:p>
         </w:tc>
@@ -11632,8 +11779,10 @@
             <w:r>
               <w:rPr>
                 <w:sz w:val="16"/>
-              </w:rPr>
-              <w:t xml:space="preserve">0.6822</w:t>
+                <w:szCs w:val="16"/>
+                <w:color w:val="000000"/>
+              </w:rPr>
+              <w:t xml:space="preserve">0.68221</w:t>
             </w:r>
           </w:p>
         </w:tc>
@@ -11646,8 +11795,10 @@
             <w:r>
               <w:rPr>
                 <w:sz w:val="16"/>
-              </w:rPr>
-              <w:t xml:space="preserve">0.9382</w:t>
+                <w:szCs w:val="16"/>
+                <w:color w:val="000000"/>
+              </w:rPr>
+              <w:t xml:space="preserve">0.938202</w:t>
             </w:r>
           </w:p>
         </w:tc>
@@ -11660,8 +11811,48 @@
             <w:r>
               <w:rPr>
                 <w:sz w:val="16"/>
-              </w:rPr>
-              <w:t xml:space="preserve">0.8463</w:t>
+                <w:szCs w:val="16"/>
+                <w:color w:val="000000"/>
+              </w:rPr>
+              <w:t xml:space="preserve">0.846348</w:t>
+            </w:r>
+          </w:p>
+        </w:tc>
+        <w:tc>
+          <w:tcPr>
+            <w:shd w:val="clear" w:color="auto" w:fill="70AD47"/>
+          </w:tcPr>
+          <w:p>
+            <w:pPr>
+              <w:jc w:val="center"/>
+            </w:pPr>
+            <w:r>
+              <w:rPr>
+                <w:sz w:val="16"/>
+                <w:szCs w:val="16"/>
+                <w:b/>
+                <w:color w:val="FFFFFF"/>
+              </w:rPr>
+              <w:t xml:space="preserve">0.938202</w:t>
+            </w:r>
+          </w:p>
+        </w:tc>
+        <w:tc>
+          <w:tcPr>
+            <w:shd w:val="clear" w:color="auto" w:fill="70AD47"/>
+          </w:tcPr>
+          <w:p>
+            <w:pPr>
+              <w:jc w:val="center"/>
+            </w:pPr>
+            <w:r>
+              <w:rPr>
+                <w:sz w:val="16"/>
+                <w:szCs w:val="16"/>
+                <w:b/>
+                <w:color w:val="FFFFFF"/>
+              </w:rPr>
+              <w:t xml:space="preserve">0.868539</w:t>
             </w:r>
           </w:p>
         </w:tc>
@@ -11674,8 +11865,10 @@
             <w:r>
               <w:rPr>
                 <w:sz w:val="16"/>
-              </w:rPr>
-              <w:t xml:space="preserve">0.9382</w:t>
+                <w:szCs w:val="16"/>
+                <w:color w:val="000000"/>
+              </w:rPr>
+              <w:t xml:space="preserve">0.932584</w:t>
             </w:r>
           </w:p>
         </w:tc>
@@ -11688,43 +11881,19 @@
             <w:r>
               <w:rPr>
                 <w:sz w:val="16"/>
-              </w:rPr>
-              <w:t xml:space="preserve">0.8685</w:t>
-            </w:r>
-          </w:p>
-        </w:tc>
-        <w:tc>
-          <w:tcPr/>
-          <w:p>
-            <w:pPr>
-              <w:jc w:val="center"/>
-            </w:pPr>
-            <w:r>
-              <w:rPr>
-                <w:sz w:val="16"/>
-              </w:rPr>
-              <w:t xml:space="preserve">0.9326</w:t>
-            </w:r>
-          </w:p>
-        </w:tc>
-        <w:tc>
-          <w:tcPr/>
-          <w:p>
-            <w:pPr>
-              <w:jc w:val="center"/>
-            </w:pPr>
-            <w:r>
-              <w:rPr>
-                <w:sz w:val="16"/>
-              </w:rPr>
-              <w:t xml:space="preserve">0.8737</w:t>
+                <w:szCs w:val="16"/>
+                <w:color w:val="000000"/>
+              </w:rPr>
+              <w:t xml:space="preserve">0.873689</w:t>
             </w:r>
           </w:p>
         </w:tc>
       </w:tr>
       <w:tr>
         <w:tc>
-          <w:tcPr/>
+          <w:tcPr>
+            <w:shd w:val="clear" w:color="auto" w:fill="F2F2F2"/>
+          </w:tcPr>
           <w:p>
             <w:pPr>
               <w:jc w:val="center"/>
@@ -11732,6 +11901,9 @@
             <w:r>
               <w:rPr>
                 <w:sz w:val="16"/>
+                <w:szCs w:val="16"/>
+                <w:b/>
+                <w:color w:val="000000"/>
               </w:rPr>
               <w:t xml:space="preserve">Google-PaLM</w:t>
             </w:r>
@@ -11746,8 +11918,10 @@
             <w:r>
               <w:rPr>
                 <w:sz w:val="16"/>
-              </w:rPr>
-              <w:t xml:space="preserve">0.8652</w:t>
+                <w:szCs w:val="16"/>
+                <w:color w:val="000000"/>
+              </w:rPr>
+              <w:t xml:space="preserve">0.865169</w:t>
             </w:r>
           </w:p>
         </w:tc>
@@ -11760,8 +11934,10 @@
             <w:r>
               <w:rPr>
                 <w:sz w:val="16"/>
-              </w:rPr>
-              <w:t xml:space="preserve">0.7195</w:t>
+                <w:szCs w:val="16"/>
+                <w:color w:val="000000"/>
+              </w:rPr>
+              <w:t xml:space="preserve">0.719476</w:t>
             </w:r>
           </w:p>
         </w:tc>
@@ -11774,8 +11950,10 @@
             <w:r>
               <w:rPr>
                 <w:sz w:val="16"/>
-              </w:rPr>
-              <w:t xml:space="preserve">0.9101</w:t>
+                <w:szCs w:val="16"/>
+                <w:color w:val="000000"/>
+              </w:rPr>
+              <w:t xml:space="preserve">0.910112</w:t>
             </w:r>
           </w:p>
         </w:tc>
@@ -11788,8 +11966,48 @@
             <w:r>
               <w:rPr>
                 <w:sz w:val="16"/>
-              </w:rPr>
-              <w:t xml:space="preserve">0.8337</w:t>
+                <w:szCs w:val="16"/>
+                <w:color w:val="000000"/>
+              </w:rPr>
+              <w:t xml:space="preserve">0.833708</w:t>
+            </w:r>
+          </w:p>
+        </w:tc>
+        <w:tc>
+          <w:tcPr>
+            <w:shd w:val="clear" w:color="auto" w:fill="70AD47"/>
+          </w:tcPr>
+          <w:p>
+            <w:pPr>
+              <w:jc w:val="center"/>
+            </w:pPr>
+            <w:r>
+              <w:rPr>
+                <w:sz w:val="16"/>
+                <w:szCs w:val="16"/>
+                <w:b/>
+                <w:color w:val="FFFFFF"/>
+              </w:rPr>
+              <w:t xml:space="preserve">0.910112</w:t>
+            </w:r>
+          </w:p>
+        </w:tc>
+        <w:tc>
+          <w:tcPr>
+            <w:shd w:val="clear" w:color="auto" w:fill="70AD47"/>
+          </w:tcPr>
+          <w:p>
+            <w:pPr>
+              <w:jc w:val="center"/>
+            </w:pPr>
+            <w:r>
+              <w:rPr>
+                <w:sz w:val="16"/>
+                <w:szCs w:val="16"/>
+                <w:b/>
+                <w:color w:val="FFFFFF"/>
+              </w:rPr>
+              <w:t xml:space="preserve">0.85309</w:t>
             </w:r>
           </w:p>
         </w:tc>
@@ -11802,8 +12020,10 @@
             <w:r>
               <w:rPr>
                 <w:sz w:val="16"/>
-              </w:rPr>
-              <w:t xml:space="preserve">0.9101</w:t>
+                <w:szCs w:val="16"/>
+                <w:color w:val="000000"/>
+              </w:rPr>
+              <w:t xml:space="preserve">0.910112</w:t>
             </w:r>
           </w:p>
         </w:tc>
@@ -11816,36 +12036,10 @@
             <w:r>
               <w:rPr>
                 <w:sz w:val="16"/>
-              </w:rPr>
-              <w:t xml:space="preserve">0.8531</w:t>
-            </w:r>
-          </w:p>
-        </w:tc>
-        <w:tc>
-          <w:tcPr/>
-          <w:p>
-            <w:pPr>
-              <w:jc w:val="center"/>
-            </w:pPr>
-            <w:r>
-              <w:rPr>
-                <w:sz w:val="16"/>
-              </w:rPr>
-              <w:t xml:space="preserve">0.9101</w:t>
-            </w:r>
-          </w:p>
-        </w:tc>
-        <w:tc>
-          <w:tcPr/>
-          <w:p>
-            <w:pPr>
-              <w:jc w:val="center"/>
-            </w:pPr>
-            <w:r>
-              <w:rPr>
-                <w:sz w:val="16"/>
-              </w:rPr>
-              <w:t xml:space="preserve">0.8557</w:t>
+                <w:szCs w:val="16"/>
+                <w:color w:val="000000"/>
+              </w:rPr>
+              <w:t xml:space="preserve">0.855712</w:t>
             </w:r>
           </w:p>
         </w:tc>

</xml_diff>